<commit_message>
atualizacao do levantamento de requisitos - adicao das alteracoes feitas e a serem feitas
</commit_message>
<xml_diff>
--- a/analise_requisitos_gerenciador_contas.docx
+++ b/analise_requisitos_gerenciador_contas.docx
@@ -790,6 +790,90 @@
         <w:pStyle w:val="PargrafodaLista"/>
         <w:numPr>
           <w:ilvl w:val="0"/>
+          <w:numId w:val="9"/>
+        </w:numPr>
+        <w:jc w:val="both"/>
+        <w:rPr>
+          <w:rFonts w:ascii="Arial" w:hAnsi="Arial" w:cs="Arial"/>
+          <w:b/>
+          <w:bCs/>
+        </w:rPr>
+      </w:pPr>
+      <w:r>
+        <w:rPr>
+          <w:rFonts w:ascii="Arial" w:hAnsi="Arial" w:cs="Arial"/>
+        </w:rPr>
+        <w:t>Operações a serem inseridas:</w:t>
+      </w:r>
+    </w:p>
+    <w:p>
+      <w:pPr>
+        <w:pStyle w:val="PargrafodaLista"/>
+        <w:numPr>
+          <w:ilvl w:val="1"/>
+          <w:numId w:val="9"/>
+        </w:numPr>
+        <w:jc w:val="both"/>
+        <w:rPr>
+          <w:rFonts w:ascii="Arial" w:hAnsi="Arial" w:cs="Arial"/>
+          <w:b/>
+          <w:bCs/>
+        </w:rPr>
+      </w:pPr>
+      <w:r>
+        <w:rPr>
+          <w:rFonts w:ascii="Arial" w:hAnsi="Arial" w:cs="Arial"/>
+        </w:rPr>
+        <w:t>criação;</w:t>
+      </w:r>
+    </w:p>
+    <w:p>
+      <w:pPr>
+        <w:pStyle w:val="PargrafodaLista"/>
+        <w:numPr>
+          <w:ilvl w:val="1"/>
+          <w:numId w:val="9"/>
+        </w:numPr>
+        <w:jc w:val="both"/>
+        <w:rPr>
+          <w:rFonts w:ascii="Arial" w:hAnsi="Arial" w:cs="Arial"/>
+          <w:b/>
+          <w:bCs/>
+        </w:rPr>
+      </w:pPr>
+      <w:r>
+        <w:rPr>
+          <w:rFonts w:ascii="Arial" w:hAnsi="Arial" w:cs="Arial"/>
+        </w:rPr>
+        <w:t>exclusão;</w:t>
+      </w:r>
+    </w:p>
+    <w:p>
+      <w:pPr>
+        <w:pStyle w:val="PargrafodaLista"/>
+        <w:numPr>
+          <w:ilvl w:val="1"/>
+          <w:numId w:val="9"/>
+        </w:numPr>
+        <w:jc w:val="both"/>
+        <w:rPr>
+          <w:rFonts w:ascii="Arial" w:hAnsi="Arial" w:cs="Arial"/>
+          <w:b/>
+          <w:bCs/>
+        </w:rPr>
+      </w:pPr>
+      <w:r>
+        <w:rPr>
+          <w:rFonts w:ascii="Arial" w:hAnsi="Arial" w:cs="Arial"/>
+        </w:rPr>
+        <w:t>atualização;</w:t>
+      </w:r>
+    </w:p>
+    <w:p>
+      <w:pPr>
+        <w:pStyle w:val="PargrafodaLista"/>
+        <w:numPr>
+          <w:ilvl w:val="0"/>
           <w:numId w:val="8"/>
         </w:numPr>
         <w:jc w:val="both"/>
@@ -801,7 +885,13 @@
         <w:rPr>
           <w:rFonts w:ascii="Arial" w:hAnsi="Arial" w:cs="Arial"/>
         </w:rPr>
-        <w:t>Dados necessários para a operação a ser realizada em relação a contas;</w:t>
+        <w:t xml:space="preserve">Dados necessários para a </w:t>
+      </w:r>
+      <w:r>
+        <w:rPr>
+          <w:rFonts w:ascii="Arial" w:hAnsi="Arial" w:cs="Arial"/>
+        </w:rPr>
+        <w:t>criação da conta:</w:t>
       </w:r>
     </w:p>
     <w:p>
@@ -935,6 +1025,83 @@
           <w:rFonts w:ascii="Arial" w:hAnsi="Arial" w:cs="Arial"/>
         </w:rPr>
         <w:t>Dígito verificador da conta;</w:t>
+      </w:r>
+    </w:p>
+    <w:p>
+      <w:pPr>
+        <w:pStyle w:val="PargrafodaLista"/>
+        <w:numPr>
+          <w:ilvl w:val="0"/>
+          <w:numId w:val="8"/>
+        </w:numPr>
+        <w:jc w:val="both"/>
+        <w:rPr>
+          <w:rFonts w:ascii="Arial" w:hAnsi="Arial" w:cs="Arial"/>
+        </w:rPr>
+      </w:pPr>
+      <w:r>
+        <w:rPr>
+          <w:rFonts w:ascii="Arial" w:hAnsi="Arial" w:cs="Arial"/>
+        </w:rPr>
+        <w:t>Dados que podem ser atualizados em uma conta:</w:t>
+      </w:r>
+    </w:p>
+    <w:p>
+      <w:pPr>
+        <w:pStyle w:val="PargrafodaLista"/>
+        <w:numPr>
+          <w:ilvl w:val="1"/>
+          <w:numId w:val="8"/>
+        </w:numPr>
+        <w:jc w:val="both"/>
+        <w:rPr>
+          <w:rFonts w:ascii="Arial" w:hAnsi="Arial" w:cs="Arial"/>
+        </w:rPr>
+      </w:pPr>
+      <w:r>
+        <w:rPr>
+          <w:rFonts w:ascii="Arial" w:hAnsi="Arial" w:cs="Arial"/>
+        </w:rPr>
+        <w:t>Nome;</w:t>
+      </w:r>
+    </w:p>
+    <w:p>
+      <w:pPr>
+        <w:pStyle w:val="PargrafodaLista"/>
+        <w:numPr>
+          <w:ilvl w:val="1"/>
+          <w:numId w:val="8"/>
+        </w:numPr>
+        <w:jc w:val="both"/>
+        <w:rPr>
+          <w:rFonts w:ascii="Arial" w:hAnsi="Arial" w:cs="Arial"/>
+        </w:rPr>
+      </w:pPr>
+      <w:r>
+        <w:rPr>
+          <w:rFonts w:ascii="Arial" w:hAnsi="Arial" w:cs="Arial"/>
+        </w:rPr>
+        <w:t>Data de nascimento;</w:t>
+      </w:r>
+    </w:p>
+    <w:p>
+      <w:pPr>
+        <w:pStyle w:val="PargrafodaLista"/>
+        <w:numPr>
+          <w:ilvl w:val="0"/>
+          <w:numId w:val="8"/>
+        </w:numPr>
+        <w:jc w:val="both"/>
+        <w:rPr>
+          <w:rFonts w:ascii="Arial" w:hAnsi="Arial" w:cs="Arial"/>
+        </w:rPr>
+      </w:pPr>
+      <w:r>
+        <w:rPr>
+          <w:rFonts w:ascii="Arial" w:hAnsi="Arial" w:cs="Arial"/>
+        </w:rPr>
+        <w:lastRenderedPageBreak/>
+        <w:t>A busca pela conta a ser excluída ou atualizada deve ser feita exclusivamente pela conta e agência da conta bancária;</w:t>
       </w:r>
     </w:p>
     <w:p>
@@ -1596,6 +1763,119 @@
     </w:lvl>
   </w:abstractNum>
   <w:abstractNum w:abstractNumId="1" w15:restartNumberingAfterBreak="0">
+    <w:nsid w:val="0FE86642"/>
+    <w:multiLevelType w:val="hybridMultilevel"/>
+    <w:tmpl w:val="8E3E85A0"/>
+    <w:lvl w:ilvl="0" w:tplc="04160001">
+      <w:start w:val="1"/>
+      <w:numFmt w:val="bullet"/>
+      <w:lvlText w:val=""/>
+      <w:lvlJc w:val="left"/>
+      <w:pPr>
+        <w:ind w:left="720" w:hanging="360"/>
+      </w:pPr>
+      <w:rPr>
+        <w:rFonts w:ascii="Symbol" w:hAnsi="Symbol" w:hint="default"/>
+      </w:rPr>
+    </w:lvl>
+    <w:lvl w:ilvl="1" w:tplc="04160003">
+      <w:start w:val="1"/>
+      <w:numFmt w:val="bullet"/>
+      <w:lvlText w:val="o"/>
+      <w:lvlJc w:val="left"/>
+      <w:pPr>
+        <w:ind w:left="1440" w:hanging="360"/>
+      </w:pPr>
+      <w:rPr>
+        <w:rFonts w:ascii="Courier New" w:hAnsi="Courier New" w:cs="Courier New" w:hint="default"/>
+      </w:rPr>
+    </w:lvl>
+    <w:lvl w:ilvl="2" w:tplc="04160005" w:tentative="1">
+      <w:start w:val="1"/>
+      <w:numFmt w:val="bullet"/>
+      <w:lvlText w:val=""/>
+      <w:lvlJc w:val="left"/>
+      <w:pPr>
+        <w:ind w:left="2160" w:hanging="360"/>
+      </w:pPr>
+      <w:rPr>
+        <w:rFonts w:ascii="Wingdings" w:hAnsi="Wingdings" w:hint="default"/>
+      </w:rPr>
+    </w:lvl>
+    <w:lvl w:ilvl="3" w:tplc="04160001" w:tentative="1">
+      <w:start w:val="1"/>
+      <w:numFmt w:val="bullet"/>
+      <w:lvlText w:val=""/>
+      <w:lvlJc w:val="left"/>
+      <w:pPr>
+        <w:ind w:left="2880" w:hanging="360"/>
+      </w:pPr>
+      <w:rPr>
+        <w:rFonts w:ascii="Symbol" w:hAnsi="Symbol" w:hint="default"/>
+      </w:rPr>
+    </w:lvl>
+    <w:lvl w:ilvl="4" w:tplc="04160003" w:tentative="1">
+      <w:start w:val="1"/>
+      <w:numFmt w:val="bullet"/>
+      <w:lvlText w:val="o"/>
+      <w:lvlJc w:val="left"/>
+      <w:pPr>
+        <w:ind w:left="3600" w:hanging="360"/>
+      </w:pPr>
+      <w:rPr>
+        <w:rFonts w:ascii="Courier New" w:hAnsi="Courier New" w:cs="Courier New" w:hint="default"/>
+      </w:rPr>
+    </w:lvl>
+    <w:lvl w:ilvl="5" w:tplc="04160005" w:tentative="1">
+      <w:start w:val="1"/>
+      <w:numFmt w:val="bullet"/>
+      <w:lvlText w:val=""/>
+      <w:lvlJc w:val="left"/>
+      <w:pPr>
+        <w:ind w:left="4320" w:hanging="360"/>
+      </w:pPr>
+      <w:rPr>
+        <w:rFonts w:ascii="Wingdings" w:hAnsi="Wingdings" w:hint="default"/>
+      </w:rPr>
+    </w:lvl>
+    <w:lvl w:ilvl="6" w:tplc="04160001" w:tentative="1">
+      <w:start w:val="1"/>
+      <w:numFmt w:val="bullet"/>
+      <w:lvlText w:val=""/>
+      <w:lvlJc w:val="left"/>
+      <w:pPr>
+        <w:ind w:left="5040" w:hanging="360"/>
+      </w:pPr>
+      <w:rPr>
+        <w:rFonts w:ascii="Symbol" w:hAnsi="Symbol" w:hint="default"/>
+      </w:rPr>
+    </w:lvl>
+    <w:lvl w:ilvl="7" w:tplc="04160003" w:tentative="1">
+      <w:start w:val="1"/>
+      <w:numFmt w:val="bullet"/>
+      <w:lvlText w:val="o"/>
+      <w:lvlJc w:val="left"/>
+      <w:pPr>
+        <w:ind w:left="5760" w:hanging="360"/>
+      </w:pPr>
+      <w:rPr>
+        <w:rFonts w:ascii="Courier New" w:hAnsi="Courier New" w:cs="Courier New" w:hint="default"/>
+      </w:rPr>
+    </w:lvl>
+    <w:lvl w:ilvl="8" w:tplc="04160005" w:tentative="1">
+      <w:start w:val="1"/>
+      <w:numFmt w:val="bullet"/>
+      <w:lvlText w:val=""/>
+      <w:lvlJc w:val="left"/>
+      <w:pPr>
+        <w:ind w:left="6480" w:hanging="360"/>
+      </w:pPr>
+      <w:rPr>
+        <w:rFonts w:ascii="Wingdings" w:hAnsi="Wingdings" w:hint="default"/>
+      </w:rPr>
+    </w:lvl>
+  </w:abstractNum>
+  <w:abstractNum w:abstractNumId="2" w15:restartNumberingAfterBreak="0">
     <w:nsid w:val="0FF31FB9"/>
     <w:multiLevelType w:val="hybridMultilevel"/>
     <w:tmpl w:val="52A02B26"/>
@@ -1708,7 +1988,7 @@
       </w:rPr>
     </w:lvl>
   </w:abstractNum>
-  <w:abstractNum w:abstractNumId="2" w15:restartNumberingAfterBreak="0">
+  <w:abstractNum w:abstractNumId="3" w15:restartNumberingAfterBreak="0">
     <w:nsid w:val="1BF54FB2"/>
     <w:multiLevelType w:val="hybridMultilevel"/>
     <w:tmpl w:val="0E6A6EB2"/>
@@ -1821,7 +2101,7 @@
       </w:rPr>
     </w:lvl>
   </w:abstractNum>
-  <w:abstractNum w:abstractNumId="3" w15:restartNumberingAfterBreak="0">
+  <w:abstractNum w:abstractNumId="4" w15:restartNumberingAfterBreak="0">
     <w:nsid w:val="39233323"/>
     <w:multiLevelType w:val="hybridMultilevel"/>
     <w:tmpl w:val="FF90F1BE"/>
@@ -1934,7 +2214,7 @@
       </w:rPr>
     </w:lvl>
   </w:abstractNum>
-  <w:abstractNum w:abstractNumId="4" w15:restartNumberingAfterBreak="0">
+  <w:abstractNum w:abstractNumId="5" w15:restartNumberingAfterBreak="0">
     <w:nsid w:val="41937359"/>
     <w:multiLevelType w:val="hybridMultilevel"/>
     <w:tmpl w:val="936868CE"/>
@@ -2047,7 +2327,7 @@
       </w:rPr>
     </w:lvl>
   </w:abstractNum>
-  <w:abstractNum w:abstractNumId="5" w15:restartNumberingAfterBreak="0">
+  <w:abstractNum w:abstractNumId="6" w15:restartNumberingAfterBreak="0">
     <w:nsid w:val="54F744A5"/>
     <w:multiLevelType w:val="hybridMultilevel"/>
     <w:tmpl w:val="DAC42E24"/>
@@ -2160,7 +2440,7 @@
       </w:rPr>
     </w:lvl>
   </w:abstractNum>
-  <w:abstractNum w:abstractNumId="6" w15:restartNumberingAfterBreak="0">
+  <w:abstractNum w:abstractNumId="7" w15:restartNumberingAfterBreak="0">
     <w:nsid w:val="5A02452E"/>
     <w:multiLevelType w:val="hybridMultilevel"/>
     <w:tmpl w:val="8CBA5E66"/>
@@ -2246,7 +2526,7 @@
       </w:pPr>
     </w:lvl>
   </w:abstractNum>
-  <w:abstractNum w:abstractNumId="7" w15:restartNumberingAfterBreak="0">
+  <w:abstractNum w:abstractNumId="8" w15:restartNumberingAfterBreak="0">
     <w:nsid w:val="70AE177A"/>
     <w:multiLevelType w:val="hybridMultilevel"/>
     <w:tmpl w:val="D42ADCE0"/>
@@ -2360,28 +2640,31 @@
     </w:lvl>
   </w:abstractNum>
   <w:num w:numId="1" w16cid:durableId="657071950">
-    <w:abstractNumId w:val="3"/>
+    <w:abstractNumId w:val="4"/>
   </w:num>
   <w:num w:numId="2" w16cid:durableId="142505159">
-    <w:abstractNumId w:val="4"/>
+    <w:abstractNumId w:val="5"/>
   </w:num>
   <w:num w:numId="3" w16cid:durableId="209272859">
-    <w:abstractNumId w:val="1"/>
+    <w:abstractNumId w:val="2"/>
   </w:num>
   <w:num w:numId="4" w16cid:durableId="799153205">
-    <w:abstractNumId w:val="6"/>
+    <w:abstractNumId w:val="7"/>
   </w:num>
   <w:num w:numId="5" w16cid:durableId="127935222">
-    <w:abstractNumId w:val="7"/>
+    <w:abstractNumId w:val="8"/>
   </w:num>
   <w:num w:numId="6" w16cid:durableId="1182548229">
-    <w:abstractNumId w:val="2"/>
+    <w:abstractNumId w:val="3"/>
   </w:num>
   <w:num w:numId="7" w16cid:durableId="1460805460">
     <w:abstractNumId w:val="0"/>
   </w:num>
   <w:num w:numId="8" w16cid:durableId="1933853919">
-    <w:abstractNumId w:val="5"/>
+    <w:abstractNumId w:val="6"/>
+  </w:num>
+  <w:num w:numId="9" w16cid:durableId="820581423">
+    <w:abstractNumId w:val="1"/>
   </w:num>
 </w:numbering>
 </file>

</xml_diff>

<commit_message>
adicao dos codigos de retorno no CTCS0002
</commit_message>
<xml_diff>
--- a/analise_requisitos_gerenciador_contas.docx
+++ b/analise_requisitos_gerenciador_contas.docx
@@ -185,14 +185,12 @@
         </w:rPr>
         <w:t xml:space="preserve">IDE utilizada no desenvolvimento: </w:t>
       </w:r>
-      <w:proofErr w:type="spellStart"/>
       <w:r>
         <w:rPr>
           <w:rFonts w:ascii="Arial" w:hAnsi="Arial" w:cs="Arial"/>
         </w:rPr>
         <w:t>OpenCOBOL</w:t>
       </w:r>
-      <w:proofErr w:type="spellEnd"/>
     </w:p>
     <w:p>
       <w:pPr>
@@ -706,31 +704,7 @@
           <w:b/>
           <w:bCs/>
         </w:rPr>
-        <w:t>Criar programa que cria, exclui ou atualiz</w:t>
-      </w:r>
-      <w:r>
-        <w:rPr>
-          <w:rFonts w:ascii="Arial" w:hAnsi="Arial" w:cs="Arial"/>
-          <w:b/>
-          <w:bCs/>
-        </w:rPr>
-        <w:t>e</w:t>
-      </w:r>
-      <w:r>
-        <w:rPr>
-          <w:rFonts w:ascii="Arial" w:hAnsi="Arial" w:cs="Arial"/>
-          <w:b/>
-          <w:bCs/>
-        </w:rPr>
-        <w:t xml:space="preserve"> conta</w:t>
-      </w:r>
-      <w:r>
-        <w:rPr>
-          <w:rFonts w:ascii="Arial" w:hAnsi="Arial" w:cs="Arial"/>
-          <w:b/>
-          <w:bCs/>
-        </w:rPr>
-        <w:t>s bancárias</w:t>
+        <w:t>Permitir criação, exclusão e atualização de contas bancárias</w:t>
       </w:r>
     </w:p>
     <w:p>
@@ -1183,7 +1157,542 @@
           <w:b/>
           <w:bCs/>
         </w:rPr>
+        <w:t>RF002 – Permitir depositar na conta</w:t>
+      </w:r>
+    </w:p>
+    <w:p>
+      <w:pPr>
+        <w:jc w:val="both"/>
+        <w:rPr>
+          <w:rFonts w:ascii="Arial" w:hAnsi="Arial" w:cs="Arial"/>
+        </w:rPr>
+      </w:pPr>
+      <w:r>
+        <w:rPr>
+          <w:rFonts w:ascii="Arial" w:hAnsi="Arial" w:cs="Arial"/>
+          <w:b/>
+          <w:bCs/>
+        </w:rPr>
+        <w:t xml:space="preserve">Descrição: </w:t>
+      </w:r>
+      <w:r>
+        <w:rPr>
+          <w:rFonts w:ascii="Arial" w:hAnsi="Arial" w:cs="Arial"/>
+        </w:rPr>
+        <w:t>o sistema deve possuir um módulo que realize o depósito na conta e salve os dados do depósito na base de dados.</w:t>
+      </w:r>
+    </w:p>
+    <w:p>
+      <w:pPr>
+        <w:jc w:val="both"/>
+        <w:rPr>
+          <w:rFonts w:ascii="Arial" w:hAnsi="Arial" w:cs="Arial"/>
+          <w:b/>
+          <w:bCs/>
+        </w:rPr>
+      </w:pPr>
+      <w:r>
+        <w:rPr>
+          <w:rFonts w:ascii="Arial" w:hAnsi="Arial" w:cs="Arial"/>
+          <w:b/>
+          <w:bCs/>
+        </w:rPr>
+        <w:t>Pré-condição e Entrada</w:t>
+      </w:r>
+    </w:p>
+    <w:p>
+      <w:pPr>
+        <w:pStyle w:val="PargrafodaLista"/>
+        <w:numPr>
+          <w:ilvl w:val="0"/>
+          <w:numId w:val="8"/>
+        </w:numPr>
+        <w:jc w:val="both"/>
+        <w:rPr>
+          <w:rFonts w:ascii="Arial" w:hAnsi="Arial" w:cs="Arial"/>
+        </w:rPr>
+      </w:pPr>
+      <w:r>
+        <w:rPr>
+          <w:rFonts w:ascii="Arial" w:hAnsi="Arial" w:cs="Arial"/>
+        </w:rPr>
+        <w:t>Operações a serem criadas:</w:t>
+      </w:r>
+    </w:p>
+    <w:p>
+      <w:pPr>
+        <w:pStyle w:val="PargrafodaLista"/>
+        <w:numPr>
+          <w:ilvl w:val="1"/>
+          <w:numId w:val="8"/>
+        </w:numPr>
+        <w:jc w:val="both"/>
+        <w:rPr>
+          <w:rFonts w:ascii="Arial" w:hAnsi="Arial" w:cs="Arial"/>
+        </w:rPr>
+      </w:pPr>
+      <w:r>
+        <w:rPr>
+          <w:rFonts w:ascii="Arial" w:hAnsi="Arial" w:cs="Arial"/>
+        </w:rPr>
+        <w:t>Depósito em uma conta existente;</w:t>
+      </w:r>
+    </w:p>
+    <w:p>
+      <w:pPr>
+        <w:pStyle w:val="PargrafodaLista"/>
+        <w:numPr>
+          <w:ilvl w:val="1"/>
+          <w:numId w:val="8"/>
+        </w:numPr>
+        <w:jc w:val="both"/>
+        <w:rPr>
+          <w:rFonts w:ascii="Arial" w:hAnsi="Arial" w:cs="Arial"/>
+        </w:rPr>
+      </w:pPr>
+      <w:r>
+        <w:rPr>
+          <w:rFonts w:ascii="Arial" w:hAnsi="Arial" w:cs="Arial"/>
+        </w:rPr>
+        <w:t>Registro do depósito deve ser salvo;</w:t>
+      </w:r>
+    </w:p>
+    <w:p>
+      <w:pPr>
+        <w:pStyle w:val="PargrafodaLista"/>
+        <w:numPr>
+          <w:ilvl w:val="0"/>
+          <w:numId w:val="8"/>
+        </w:numPr>
+        <w:jc w:val="both"/>
+        <w:rPr>
+          <w:rFonts w:ascii="Arial" w:hAnsi="Arial" w:cs="Arial"/>
+        </w:rPr>
+      </w:pPr>
+      <w:r>
+        <w:rPr>
+          <w:rFonts w:ascii="Arial" w:hAnsi="Arial" w:cs="Arial"/>
+        </w:rPr>
+        <w:t>Dados necessários para a realização do depósito:</w:t>
+      </w:r>
+    </w:p>
+    <w:p>
+      <w:pPr>
+        <w:pStyle w:val="PargrafodaLista"/>
+        <w:numPr>
+          <w:ilvl w:val="1"/>
+          <w:numId w:val="8"/>
+        </w:numPr>
+        <w:jc w:val="both"/>
+        <w:rPr>
+          <w:rFonts w:ascii="Arial" w:hAnsi="Arial" w:cs="Arial"/>
+        </w:rPr>
+      </w:pPr>
+      <w:r>
+        <w:rPr>
+          <w:rFonts w:ascii="Arial" w:hAnsi="Arial" w:cs="Arial"/>
+        </w:rPr>
+        <w:t>Agência;</w:t>
+      </w:r>
+    </w:p>
+    <w:p>
+      <w:pPr>
+        <w:pStyle w:val="PargrafodaLista"/>
+        <w:numPr>
+          <w:ilvl w:val="1"/>
+          <w:numId w:val="8"/>
+        </w:numPr>
+        <w:jc w:val="both"/>
+        <w:rPr>
+          <w:rFonts w:ascii="Arial" w:hAnsi="Arial" w:cs="Arial"/>
+        </w:rPr>
+      </w:pPr>
+      <w:r>
+        <w:rPr>
+          <w:rFonts w:ascii="Arial" w:hAnsi="Arial" w:cs="Arial"/>
+        </w:rPr>
+        <w:t>Conta;</w:t>
+      </w:r>
+    </w:p>
+    <w:p>
+      <w:pPr>
+        <w:pStyle w:val="PargrafodaLista"/>
+        <w:numPr>
+          <w:ilvl w:val="1"/>
+          <w:numId w:val="8"/>
+        </w:numPr>
+        <w:jc w:val="both"/>
+        <w:rPr>
+          <w:rFonts w:ascii="Arial" w:hAnsi="Arial" w:cs="Arial"/>
+        </w:rPr>
+      </w:pPr>
+      <w:r>
+        <w:rPr>
+          <w:rFonts w:ascii="Arial" w:hAnsi="Arial" w:cs="Arial"/>
+        </w:rPr>
+        <w:t>Valor do depósito;</w:t>
+      </w:r>
+    </w:p>
+    <w:p>
+      <w:pPr>
+        <w:jc w:val="both"/>
+        <w:rPr>
+          <w:rFonts w:ascii="Arial" w:hAnsi="Arial" w:cs="Arial"/>
+          <w:b/>
+          <w:bCs/>
+        </w:rPr>
+      </w:pPr>
+      <w:r>
+        <w:rPr>
+          <w:rFonts w:ascii="Arial" w:hAnsi="Arial" w:cs="Arial"/>
+          <w:b/>
+          <w:bCs/>
+        </w:rPr>
+        <w:t>Pós-condição e Saída</w:t>
+      </w:r>
+    </w:p>
+    <w:p>
+      <w:pPr>
+        <w:pStyle w:val="PargrafodaLista"/>
+        <w:numPr>
+          <w:ilvl w:val="0"/>
+          <w:numId w:val="10"/>
+        </w:numPr>
+        <w:jc w:val="both"/>
+        <w:rPr>
+          <w:rFonts w:ascii="Arial" w:hAnsi="Arial" w:cs="Arial"/>
+          <w:b/>
+          <w:bCs/>
+        </w:rPr>
+      </w:pPr>
+      <w:r>
+        <w:rPr>
+          <w:rFonts w:ascii="Arial" w:hAnsi="Arial" w:cs="Arial"/>
+        </w:rPr>
+        <w:t>Mensagem resultante da operação;</w:t>
+      </w:r>
+    </w:p>
+    <w:p>
+      <w:pPr>
+        <w:jc w:val="both"/>
+        <w:rPr>
+          <w:rFonts w:ascii="Arial" w:hAnsi="Arial" w:cs="Arial"/>
+          <w:b/>
+          <w:bCs/>
+        </w:rPr>
+      </w:pPr>
+    </w:p>
+    <w:p>
+      <w:pPr>
+        <w:jc w:val="both"/>
+        <w:rPr>
+          <w:rFonts w:ascii="Arial" w:hAnsi="Arial" w:cs="Arial"/>
+          <w:b/>
+          <w:bCs/>
+        </w:rPr>
+      </w:pPr>
+      <w:r>
+        <w:rPr>
+          <w:rFonts w:ascii="Arial" w:hAnsi="Arial" w:cs="Arial"/>
+          <w:b/>
+          <w:bCs/>
+        </w:rPr>
         <w:t>Requisitos não funcionais</w:t>
+      </w:r>
+    </w:p>
+    <w:p>
+      <w:pPr>
+        <w:jc w:val="both"/>
+        <w:rPr>
+          <w:rFonts w:ascii="Arial" w:hAnsi="Arial" w:cs="Arial"/>
+          <w:b/>
+          <w:bCs/>
+        </w:rPr>
+      </w:pPr>
+      <w:r>
+        <w:rPr>
+          <w:rFonts w:ascii="Arial" w:hAnsi="Arial" w:cs="Arial"/>
+          <w:b/>
+          <w:bCs/>
+        </w:rPr>
+        <w:t>RNF001 – Template padrão</w:t>
+      </w:r>
+      <w:r>
+        <w:rPr>
+          <w:rFonts w:ascii="Arial" w:hAnsi="Arial" w:cs="Arial"/>
+          <w:b/>
+          <w:bCs/>
+        </w:rPr>
+        <w:t xml:space="preserve"> dedocumentação interna</w:t>
+      </w:r>
+      <w:r>
+        <w:rPr>
+          <w:rFonts w:ascii="Arial" w:hAnsi="Arial" w:cs="Arial"/>
+          <w:b/>
+          <w:bCs/>
+        </w:rPr>
+        <w:t xml:space="preserve"> de programas COBOL</w:t>
+      </w:r>
+    </w:p>
+    <w:p>
+      <w:pPr>
+        <w:jc w:val="both"/>
+        <w:rPr>
+          <w:rFonts w:ascii="Arial" w:hAnsi="Arial" w:cs="Arial"/>
+        </w:rPr>
+      </w:pPr>
+      <w:r>
+        <w:rPr>
+          <w:rFonts w:ascii="Arial" w:hAnsi="Arial" w:cs="Arial"/>
+        </w:rPr>
+        <w:t>*------------------------------------------------------------------------</w:t>
+      </w:r>
+    </w:p>
+    <w:p>
+      <w:pPr>
+        <w:jc w:val="both"/>
+        <w:rPr>
+          <w:rFonts w:ascii="Arial" w:hAnsi="Arial" w:cs="Arial"/>
+        </w:rPr>
+      </w:pPr>
+      <w:r>
+        <w:rPr>
+          <w:rFonts w:ascii="Arial" w:hAnsi="Arial" w:cs="Arial"/>
+        </w:rPr>
+        <w:t xml:space="preserve">* PROGRAMADOR: </w:t>
+      </w:r>
+      <w:r>
+        <w:rPr>
+          <w:rFonts w:ascii="Arial" w:hAnsi="Arial" w:cs="Arial"/>
+        </w:rPr>
+        <w:t>Nome do desenvolvedor.</w:t>
+      </w:r>
+    </w:p>
+    <w:p>
+      <w:pPr>
+        <w:jc w:val="both"/>
+        <w:rPr>
+          <w:rFonts w:ascii="Arial" w:hAnsi="Arial" w:cs="Arial"/>
+        </w:rPr>
+      </w:pPr>
+      <w:r>
+        <w:rPr>
+          <w:rFonts w:ascii="Arial" w:hAnsi="Arial" w:cs="Arial"/>
+        </w:rPr>
+        <w:t xml:space="preserve">* SIGLA......: </w:t>
+      </w:r>
+      <w:r>
+        <w:rPr>
+          <w:rFonts w:ascii="Arial" w:hAnsi="Arial" w:cs="Arial"/>
+        </w:rPr>
+        <w:t>Sigla – Nome da sigla (ou sistema).</w:t>
+      </w:r>
+    </w:p>
+    <w:p>
+      <w:pPr>
+        <w:jc w:val="both"/>
+        <w:rPr>
+          <w:rFonts w:ascii="Arial" w:hAnsi="Arial" w:cs="Arial"/>
+        </w:rPr>
+      </w:pPr>
+      <w:r>
+        <w:rPr>
+          <w:rFonts w:ascii="Arial" w:hAnsi="Arial" w:cs="Arial"/>
+        </w:rPr>
+        <w:t xml:space="preserve">* OBJETIVO...: </w:t>
+      </w:r>
+      <w:r>
+        <w:rPr>
+          <w:rFonts w:ascii="Arial" w:hAnsi="Arial" w:cs="Arial"/>
+        </w:rPr>
+        <w:t>Objetivo do programa.</w:t>
+      </w:r>
+    </w:p>
+    <w:p>
+      <w:pPr>
+        <w:jc w:val="both"/>
+        <w:rPr>
+          <w:rFonts w:ascii="Arial" w:hAnsi="Arial" w:cs="Arial"/>
+        </w:rPr>
+      </w:pPr>
+      <w:r>
+        <w:rPr>
+          <w:rFonts w:ascii="Arial" w:hAnsi="Arial" w:cs="Arial"/>
+        </w:rPr>
+        <w:t xml:space="preserve">* DATA DE CRIACAO: </w:t>
+      </w:r>
+      <w:r>
+        <w:rPr>
+          <w:rFonts w:ascii="Arial" w:hAnsi="Arial" w:cs="Arial"/>
+        </w:rPr>
+        <w:t>Data de criação do programa.</w:t>
+      </w:r>
+    </w:p>
+    <w:p>
+      <w:pPr>
+        <w:jc w:val="both"/>
+        <w:rPr>
+          <w:rFonts w:ascii="Arial" w:hAnsi="Arial" w:cs="Arial"/>
+        </w:rPr>
+      </w:pPr>
+      <w:r>
+        <w:rPr>
+          <w:rFonts w:ascii="Arial" w:hAnsi="Arial" w:cs="Arial"/>
+        </w:rPr>
+        <w:t>*------------------------------------------------------------------------</w:t>
+      </w:r>
+    </w:p>
+    <w:p>
+      <w:pPr>
+        <w:jc w:val="both"/>
+        <w:rPr>
+          <w:rFonts w:ascii="Arial" w:hAnsi="Arial" w:cs="Arial"/>
+          <w:b/>
+          <w:bCs/>
+        </w:rPr>
+      </w:pPr>
+    </w:p>
+    <w:p>
+      <w:pPr>
+        <w:jc w:val="both"/>
+        <w:rPr>
+          <w:rFonts w:ascii="Arial" w:hAnsi="Arial" w:cs="Arial"/>
+          <w:b/>
+          <w:bCs/>
+        </w:rPr>
+      </w:pPr>
+      <w:r>
+        <w:rPr>
+          <w:rFonts w:ascii="Arial" w:hAnsi="Arial" w:cs="Arial"/>
+          <w:b/>
+          <w:bCs/>
+        </w:rPr>
+        <w:t>RNF00</w:t>
+      </w:r>
+      <w:r>
+        <w:rPr>
+          <w:rFonts w:ascii="Arial" w:hAnsi="Arial" w:cs="Arial"/>
+          <w:b/>
+          <w:bCs/>
+        </w:rPr>
+        <w:t>2</w:t>
+      </w:r>
+      <w:r>
+        <w:rPr>
+          <w:rFonts w:ascii="Arial" w:hAnsi="Arial" w:cs="Arial"/>
+          <w:b/>
+          <w:bCs/>
+        </w:rPr>
+        <w:t xml:space="preserve"> – Padrão que deve ser adotado quanto a códigos internos dos programas</w:t>
+      </w:r>
+    </w:p>
+    <w:p>
+      <w:pPr>
+        <w:pStyle w:val="PargrafodaLista"/>
+        <w:numPr>
+          <w:ilvl w:val="0"/>
+          <w:numId w:val="10"/>
+        </w:numPr>
+        <w:jc w:val="both"/>
+        <w:rPr>
+          <w:rFonts w:ascii="Arial" w:hAnsi="Arial" w:cs="Arial"/>
+        </w:rPr>
+      </w:pPr>
+      <w:r>
+        <w:rPr>
+          <w:rFonts w:ascii="Arial" w:hAnsi="Arial" w:cs="Arial"/>
+          <w:b/>
+          <w:bCs/>
+        </w:rPr>
+        <w:t>0000</w:t>
+      </w:r>
+      <w:r>
+        <w:rPr>
+          <w:rFonts w:ascii="Arial" w:hAnsi="Arial" w:cs="Arial"/>
+        </w:rPr>
+        <w:t xml:space="preserve"> OK </w:t>
+      </w:r>
+    </w:p>
+    <w:p>
+      <w:pPr>
+        <w:pStyle w:val="PargrafodaLista"/>
+        <w:numPr>
+          <w:ilvl w:val="0"/>
+          <w:numId w:val="10"/>
+        </w:numPr>
+        <w:jc w:val="both"/>
+        <w:rPr>
+          <w:rFonts w:ascii="Arial" w:hAnsi="Arial" w:cs="Arial"/>
+        </w:rPr>
+      </w:pPr>
+      <w:r>
+        <w:rPr>
+          <w:rFonts w:ascii="Arial" w:hAnsi="Arial" w:cs="Arial"/>
+          <w:b/>
+          <w:bCs/>
+        </w:rPr>
+        <w:lastRenderedPageBreak/>
+        <w:t>1000–1999</w:t>
+      </w:r>
+      <w:r>
+        <w:rPr>
+          <w:rFonts w:ascii="Arial" w:hAnsi="Arial" w:cs="Arial"/>
+        </w:rPr>
+        <w:t xml:space="preserve"> Regras de negócio (validações, elegibilidade, etc.) </w:t>
+      </w:r>
+    </w:p>
+    <w:p>
+      <w:pPr>
+        <w:pStyle w:val="PargrafodaLista"/>
+        <w:numPr>
+          <w:ilvl w:val="0"/>
+          <w:numId w:val="10"/>
+        </w:numPr>
+        <w:jc w:val="both"/>
+        <w:rPr>
+          <w:rFonts w:ascii="Arial" w:hAnsi="Arial" w:cs="Arial"/>
+        </w:rPr>
+      </w:pPr>
+      <w:r>
+        <w:rPr>
+          <w:rFonts w:ascii="Arial" w:hAnsi="Arial" w:cs="Arial"/>
+          <w:b/>
+          <w:bCs/>
+        </w:rPr>
+        <w:t>2000–2999</w:t>
+      </w:r>
+      <w:r>
+        <w:rPr>
+          <w:rFonts w:ascii="Arial" w:hAnsi="Arial" w:cs="Arial"/>
+        </w:rPr>
+        <w:t xml:space="preserve"> Arquivo/VSAM/I-O (mapeando FILE STATUS) </w:t>
+      </w:r>
+    </w:p>
+    <w:p>
+      <w:pPr>
+        <w:pStyle w:val="PargrafodaLista"/>
+        <w:numPr>
+          <w:ilvl w:val="0"/>
+          <w:numId w:val="10"/>
+        </w:numPr>
+        <w:jc w:val="both"/>
+        <w:rPr>
+          <w:rFonts w:ascii="Arial" w:hAnsi="Arial" w:cs="Arial"/>
+        </w:rPr>
+      </w:pPr>
+      <w:r>
+        <w:rPr>
+          <w:rFonts w:ascii="Arial" w:hAnsi="Arial" w:cs="Arial"/>
+          <w:b/>
+          <w:bCs/>
+        </w:rPr>
+        <w:t>9000–9999</w:t>
+      </w:r>
+      <w:r>
+        <w:rPr>
+          <w:rFonts w:ascii="Arial" w:hAnsi="Arial" w:cs="Arial"/>
+        </w:rPr>
+        <w:t xml:space="preserve"> Inesperado (defeito, condição não mapeada)</w:t>
       </w:r>
     </w:p>
     <w:p>
@@ -1650,6 +2159,119 @@
 <file path=word/numbering.xml><?xml version="1.0" encoding="utf-8"?>
 <w:numbering xmlns:wpc="http://schemas.microsoft.com/office/word/2010/wordprocessingCanvas" xmlns:cx="http://schemas.microsoft.com/office/drawing/2014/chartex" xmlns:cx1="http://schemas.microsoft.com/office/drawing/2015/9/8/chartex" xmlns:cx2="http://schemas.microsoft.com/office/drawing/2015/10/21/chartex" xmlns:cx3="http://schemas.microsoft.com/office/drawing/2016/5/9/chartex" xmlns:cx4="http://schemas.microsoft.com/office/drawing/2016/5/10/chartex" xmlns:cx5="http://schemas.microsoft.com/office/drawing/2016/5/11/chartex" xmlns:cx6="http://schemas.microsoft.com/office/drawing/2016/5/12/chartex" xmlns:cx7="http://schemas.microsoft.com/office/drawing/2016/5/13/chartex" xmlns:cx8="http://schemas.microsoft.com/office/drawing/2016/5/14/chartex" xmlns:mc="http://schemas.openxmlformats.org/markup-compatibility/2006" xmlns:aink="http://schemas.microsoft.com/office/drawing/2016/ink" xmlns:am3d="http://schemas.microsoft.com/office/drawing/2017/model3d" xmlns:o="urn:schemas-microsoft-com:office:office" xmlns:oel="http://schemas.microsoft.com/office/2019/extlst" xmlns:r="http://schemas.openxmlformats.org/officeDocument/2006/relationships" xmlns:m="http://schemas.openxmlformats.org/officeDocument/2006/math" xmlns:v="urn:schemas-microsoft-com:vml" xmlns:wp14="http://schemas.microsoft.com/office/word/2010/wordprocessingDrawing" xmlns:wp="http://schemas.openxmlformats.org/drawingml/2006/wordprocessingDrawing" xmlns:w10="urn:schemas-microsoft-com:office:word" xmlns:w="http://schemas.openxmlformats.org/wordprocessingml/2006/main" xmlns:w14="http://schemas.microsoft.com/office/word/2010/wordml" xmlns:w15="http://schemas.microsoft.com/office/word/2012/wordml" xmlns:w16cex="http://schemas.microsoft.com/office/word/2018/wordml/cex" xmlns:w16cid="http://schemas.microsoft.com/office/word/2016/wordml/cid" xmlns:w16="http://schemas.microsoft.com/office/word/2018/wordml" xmlns:w16du="http://schemas.microsoft.com/office/word/2023/wordml/word16du" xmlns:w16sdtdh="http://schemas.microsoft.com/office/word/2020/wordml/sdtdatahash" xmlns:w16sdtfl="http://schemas.microsoft.com/office/word/2024/wordml/sdtformatlock" xmlns:w16se="http://schemas.microsoft.com/office/word/2015/wordml/symex" xmlns:wpg="http://schemas.microsoft.com/office/word/2010/wordprocessingGroup" xmlns:wpi="http://schemas.microsoft.com/office/word/2010/wordprocessingInk" xmlns:wne="http://schemas.microsoft.com/office/word/2006/wordml" xmlns:wps="http://schemas.microsoft.com/office/word/2010/wordprocessingShape" mc:Ignorable="w14 w15 w16se w16cid w16 w16cex w16sdtdh w16sdtfl w16du wp14">
   <w:abstractNum w:abstractNumId="0" w15:restartNumberingAfterBreak="0">
+    <w:nsid w:val="0B480310"/>
+    <w:multiLevelType w:val="hybridMultilevel"/>
+    <w:tmpl w:val="13D09A38"/>
+    <w:lvl w:ilvl="0" w:tplc="04160001">
+      <w:start w:val="1"/>
+      <w:numFmt w:val="bullet"/>
+      <w:lvlText w:val=""/>
+      <w:lvlJc w:val="left"/>
+      <w:pPr>
+        <w:ind w:left="720" w:hanging="360"/>
+      </w:pPr>
+      <w:rPr>
+        <w:rFonts w:ascii="Symbol" w:hAnsi="Symbol" w:hint="default"/>
+      </w:rPr>
+    </w:lvl>
+    <w:lvl w:ilvl="1" w:tplc="04160003" w:tentative="1">
+      <w:start w:val="1"/>
+      <w:numFmt w:val="bullet"/>
+      <w:lvlText w:val="o"/>
+      <w:lvlJc w:val="left"/>
+      <w:pPr>
+        <w:ind w:left="1440" w:hanging="360"/>
+      </w:pPr>
+      <w:rPr>
+        <w:rFonts w:ascii="Courier New" w:hAnsi="Courier New" w:cs="Courier New" w:hint="default"/>
+      </w:rPr>
+    </w:lvl>
+    <w:lvl w:ilvl="2" w:tplc="04160005" w:tentative="1">
+      <w:start w:val="1"/>
+      <w:numFmt w:val="bullet"/>
+      <w:lvlText w:val=""/>
+      <w:lvlJc w:val="left"/>
+      <w:pPr>
+        <w:ind w:left="2160" w:hanging="360"/>
+      </w:pPr>
+      <w:rPr>
+        <w:rFonts w:ascii="Wingdings" w:hAnsi="Wingdings" w:hint="default"/>
+      </w:rPr>
+    </w:lvl>
+    <w:lvl w:ilvl="3" w:tplc="04160001" w:tentative="1">
+      <w:start w:val="1"/>
+      <w:numFmt w:val="bullet"/>
+      <w:lvlText w:val=""/>
+      <w:lvlJc w:val="left"/>
+      <w:pPr>
+        <w:ind w:left="2880" w:hanging="360"/>
+      </w:pPr>
+      <w:rPr>
+        <w:rFonts w:ascii="Symbol" w:hAnsi="Symbol" w:hint="default"/>
+      </w:rPr>
+    </w:lvl>
+    <w:lvl w:ilvl="4" w:tplc="04160003" w:tentative="1">
+      <w:start w:val="1"/>
+      <w:numFmt w:val="bullet"/>
+      <w:lvlText w:val="o"/>
+      <w:lvlJc w:val="left"/>
+      <w:pPr>
+        <w:ind w:left="3600" w:hanging="360"/>
+      </w:pPr>
+      <w:rPr>
+        <w:rFonts w:ascii="Courier New" w:hAnsi="Courier New" w:cs="Courier New" w:hint="default"/>
+      </w:rPr>
+    </w:lvl>
+    <w:lvl w:ilvl="5" w:tplc="04160005" w:tentative="1">
+      <w:start w:val="1"/>
+      <w:numFmt w:val="bullet"/>
+      <w:lvlText w:val=""/>
+      <w:lvlJc w:val="left"/>
+      <w:pPr>
+        <w:ind w:left="4320" w:hanging="360"/>
+      </w:pPr>
+      <w:rPr>
+        <w:rFonts w:ascii="Wingdings" w:hAnsi="Wingdings" w:hint="default"/>
+      </w:rPr>
+    </w:lvl>
+    <w:lvl w:ilvl="6" w:tplc="04160001" w:tentative="1">
+      <w:start w:val="1"/>
+      <w:numFmt w:val="bullet"/>
+      <w:lvlText w:val=""/>
+      <w:lvlJc w:val="left"/>
+      <w:pPr>
+        <w:ind w:left="5040" w:hanging="360"/>
+      </w:pPr>
+      <w:rPr>
+        <w:rFonts w:ascii="Symbol" w:hAnsi="Symbol" w:hint="default"/>
+      </w:rPr>
+    </w:lvl>
+    <w:lvl w:ilvl="7" w:tplc="04160003" w:tentative="1">
+      <w:start w:val="1"/>
+      <w:numFmt w:val="bullet"/>
+      <w:lvlText w:val="o"/>
+      <w:lvlJc w:val="left"/>
+      <w:pPr>
+        <w:ind w:left="5760" w:hanging="360"/>
+      </w:pPr>
+      <w:rPr>
+        <w:rFonts w:ascii="Courier New" w:hAnsi="Courier New" w:cs="Courier New" w:hint="default"/>
+      </w:rPr>
+    </w:lvl>
+    <w:lvl w:ilvl="8" w:tplc="04160005" w:tentative="1">
+      <w:start w:val="1"/>
+      <w:numFmt w:val="bullet"/>
+      <w:lvlText w:val=""/>
+      <w:lvlJc w:val="left"/>
+      <w:pPr>
+        <w:ind w:left="6480" w:hanging="360"/>
+      </w:pPr>
+      <w:rPr>
+        <w:rFonts w:ascii="Wingdings" w:hAnsi="Wingdings" w:hint="default"/>
+      </w:rPr>
+    </w:lvl>
+  </w:abstractNum>
+  <w:abstractNum w:abstractNumId="1" w15:restartNumberingAfterBreak="0">
     <w:nsid w:val="0C5665A5"/>
     <w:multiLevelType w:val="hybridMultilevel"/>
     <w:tmpl w:val="C4EE99AA"/>
@@ -1762,7 +2384,7 @@
       </w:rPr>
     </w:lvl>
   </w:abstractNum>
-  <w:abstractNum w:abstractNumId="1" w15:restartNumberingAfterBreak="0">
+  <w:abstractNum w:abstractNumId="2" w15:restartNumberingAfterBreak="0">
     <w:nsid w:val="0FE86642"/>
     <w:multiLevelType w:val="hybridMultilevel"/>
     <w:tmpl w:val="8E3E85A0"/>
@@ -1875,7 +2497,7 @@
       </w:rPr>
     </w:lvl>
   </w:abstractNum>
-  <w:abstractNum w:abstractNumId="2" w15:restartNumberingAfterBreak="0">
+  <w:abstractNum w:abstractNumId="3" w15:restartNumberingAfterBreak="0">
     <w:nsid w:val="0FF31FB9"/>
     <w:multiLevelType w:val="hybridMultilevel"/>
     <w:tmpl w:val="52A02B26"/>
@@ -1988,7 +2610,7 @@
       </w:rPr>
     </w:lvl>
   </w:abstractNum>
-  <w:abstractNum w:abstractNumId="3" w15:restartNumberingAfterBreak="0">
+  <w:abstractNum w:abstractNumId="4" w15:restartNumberingAfterBreak="0">
     <w:nsid w:val="1BF54FB2"/>
     <w:multiLevelType w:val="hybridMultilevel"/>
     <w:tmpl w:val="0E6A6EB2"/>
@@ -2101,7 +2723,7 @@
       </w:rPr>
     </w:lvl>
   </w:abstractNum>
-  <w:abstractNum w:abstractNumId="4" w15:restartNumberingAfterBreak="0">
+  <w:abstractNum w:abstractNumId="5" w15:restartNumberingAfterBreak="0">
     <w:nsid w:val="39233323"/>
     <w:multiLevelType w:val="hybridMultilevel"/>
     <w:tmpl w:val="FF90F1BE"/>
@@ -2214,7 +2836,7 @@
       </w:rPr>
     </w:lvl>
   </w:abstractNum>
-  <w:abstractNum w:abstractNumId="5" w15:restartNumberingAfterBreak="0">
+  <w:abstractNum w:abstractNumId="6" w15:restartNumberingAfterBreak="0">
     <w:nsid w:val="41937359"/>
     <w:multiLevelType w:val="hybridMultilevel"/>
     <w:tmpl w:val="936868CE"/>
@@ -2327,10 +2949,10 @@
       </w:rPr>
     </w:lvl>
   </w:abstractNum>
-  <w:abstractNum w:abstractNumId="6" w15:restartNumberingAfterBreak="0">
+  <w:abstractNum w:abstractNumId="7" w15:restartNumberingAfterBreak="0">
     <w:nsid w:val="54F744A5"/>
     <w:multiLevelType w:val="hybridMultilevel"/>
-    <w:tmpl w:val="DAC42E24"/>
+    <w:tmpl w:val="F09A036A"/>
     <w:lvl w:ilvl="0" w:tplc="04160001">
       <w:start w:val="1"/>
       <w:numFmt w:val="bullet"/>
@@ -2440,7 +3062,7 @@
       </w:rPr>
     </w:lvl>
   </w:abstractNum>
-  <w:abstractNum w:abstractNumId="7" w15:restartNumberingAfterBreak="0">
+  <w:abstractNum w:abstractNumId="8" w15:restartNumberingAfterBreak="0">
     <w:nsid w:val="5A02452E"/>
     <w:multiLevelType w:val="hybridMultilevel"/>
     <w:tmpl w:val="8CBA5E66"/>
@@ -2526,7 +3148,7 @@
       </w:pPr>
     </w:lvl>
   </w:abstractNum>
-  <w:abstractNum w:abstractNumId="8" w15:restartNumberingAfterBreak="0">
+  <w:abstractNum w:abstractNumId="9" w15:restartNumberingAfterBreak="0">
     <w:nsid w:val="70AE177A"/>
     <w:multiLevelType w:val="hybridMultilevel"/>
     <w:tmpl w:val="D42ADCE0"/>
@@ -2640,31 +3262,34 @@
     </w:lvl>
   </w:abstractNum>
   <w:num w:numId="1" w16cid:durableId="657071950">
+    <w:abstractNumId w:val="5"/>
+  </w:num>
+  <w:num w:numId="2" w16cid:durableId="142505159">
+    <w:abstractNumId w:val="6"/>
+  </w:num>
+  <w:num w:numId="3" w16cid:durableId="209272859">
+    <w:abstractNumId w:val="3"/>
+  </w:num>
+  <w:num w:numId="4" w16cid:durableId="799153205">
+    <w:abstractNumId w:val="8"/>
+  </w:num>
+  <w:num w:numId="5" w16cid:durableId="127935222">
+    <w:abstractNumId w:val="9"/>
+  </w:num>
+  <w:num w:numId="6" w16cid:durableId="1182548229">
     <w:abstractNumId w:val="4"/>
   </w:num>
-  <w:num w:numId="2" w16cid:durableId="142505159">
-    <w:abstractNumId w:val="5"/>
+  <w:num w:numId="7" w16cid:durableId="1460805460">
+    <w:abstractNumId w:val="1"/>
   </w:num>
-  <w:num w:numId="3" w16cid:durableId="209272859">
+  <w:num w:numId="8" w16cid:durableId="1933853919">
+    <w:abstractNumId w:val="7"/>
+  </w:num>
+  <w:num w:numId="9" w16cid:durableId="820581423">
     <w:abstractNumId w:val="2"/>
   </w:num>
-  <w:num w:numId="4" w16cid:durableId="799153205">
-    <w:abstractNumId w:val="7"/>
-  </w:num>
-  <w:num w:numId="5" w16cid:durableId="127935222">
-    <w:abstractNumId w:val="8"/>
-  </w:num>
-  <w:num w:numId="6" w16cid:durableId="1182548229">
-    <w:abstractNumId w:val="3"/>
-  </w:num>
-  <w:num w:numId="7" w16cid:durableId="1460805460">
+  <w:num w:numId="10" w16cid:durableId="327711034">
     <w:abstractNumId w:val="0"/>
-  </w:num>
-  <w:num w:numId="8" w16cid:durableId="1933853919">
-    <w:abstractNumId w:val="6"/>
-  </w:num>
-  <w:num w:numId="9" w16cid:durableId="820581423">
-    <w:abstractNumId w:val="1"/>
   </w:num>
 </w:numbering>
 </file>
@@ -3272,7 +3897,6 @@
   <w:style w:type="character" w:default="1" w:styleId="Fontepargpadro">
     <w:name w:val="Default Paragraph Font"/>
     <w:uiPriority w:val="1"/>
-    <w:semiHidden/>
     <w:unhideWhenUsed/>
   </w:style>
   <w:style w:type="table" w:default="1" w:styleId="Tabelanormal">

</xml_diff>

<commit_message>
termino - fluxo - CTCS0003 - tratamento de erros nao finalizado
</commit_message>
<xml_diff>
--- a/analise_requisitos_gerenciador_contas.docx
+++ b/analise_requisitos_gerenciador_contas.docx
@@ -185,12 +185,14 @@
         </w:rPr>
         <w:t xml:space="preserve">IDE utilizada no desenvolvimento: </w:t>
       </w:r>
+      <w:proofErr w:type="spellStart"/>
       <w:r>
         <w:rPr>
           <w:rFonts w:ascii="Arial" w:hAnsi="Arial" w:cs="Arial"/>
         </w:rPr>
         <w:t>OpenCOBOL</w:t>
       </w:r>
+      <w:proofErr w:type="spellEnd"/>
     </w:p>
     <w:p>
       <w:pPr>
@@ -1415,15 +1417,51 @@
           <w:b/>
           <w:bCs/>
         </w:rPr>
-        <w:t>RNF001 – Template padrão</w:t>
-      </w:r>
-      <w:r>
-        <w:rPr>
-          <w:rFonts w:ascii="Arial" w:hAnsi="Arial" w:cs="Arial"/>
-          <w:b/>
-          <w:bCs/>
-        </w:rPr>
-        <w:t xml:space="preserve"> dedocumentação interna</w:t>
+        <w:t xml:space="preserve">RNF001 – </w:t>
+      </w:r>
+      <w:proofErr w:type="spellStart"/>
+      <w:r>
+        <w:rPr>
+          <w:rFonts w:ascii="Arial" w:hAnsi="Arial" w:cs="Arial"/>
+          <w:b/>
+          <w:bCs/>
+        </w:rPr>
+        <w:t>Template</w:t>
+      </w:r>
+      <w:proofErr w:type="spellEnd"/>
+      <w:r>
+        <w:rPr>
+          <w:rFonts w:ascii="Arial" w:hAnsi="Arial" w:cs="Arial"/>
+          <w:b/>
+          <w:bCs/>
+        </w:rPr>
+        <w:t xml:space="preserve"> padrão</w:t>
+      </w:r>
+      <w:r>
+        <w:rPr>
+          <w:rFonts w:ascii="Arial" w:hAnsi="Arial" w:cs="Arial"/>
+          <w:b/>
+          <w:bCs/>
+        </w:rPr>
+        <w:t xml:space="preserve"> </w:t>
+      </w:r>
+      <w:proofErr w:type="spellStart"/>
+      <w:r>
+        <w:rPr>
+          <w:rFonts w:ascii="Arial" w:hAnsi="Arial" w:cs="Arial"/>
+          <w:b/>
+          <w:bCs/>
+        </w:rPr>
+        <w:t>dedocumentação</w:t>
+      </w:r>
+      <w:proofErr w:type="spellEnd"/>
+      <w:r>
+        <w:rPr>
+          <w:rFonts w:ascii="Arial" w:hAnsi="Arial" w:cs="Arial"/>
+          <w:b/>
+          <w:bCs/>
+        </w:rPr>
+        <w:t xml:space="preserve"> interna</w:t>
       </w:r>
       <w:r>
         <w:rPr>
@@ -1610,7 +1648,13 @@
         <w:rPr>
           <w:rFonts w:ascii="Arial" w:hAnsi="Arial" w:cs="Arial"/>
         </w:rPr>
-        <w:t xml:space="preserve"> OK </w:t>
+        <w:t xml:space="preserve"> - </w:t>
+      </w:r>
+      <w:r>
+        <w:rPr>
+          <w:rFonts w:ascii="Arial" w:hAnsi="Arial" w:cs="Arial"/>
+        </w:rPr>
+        <w:t xml:space="preserve">OK </w:t>
       </w:r>
     </w:p>
     <w:p>
@@ -1637,8 +1681,30 @@
       <w:r>
         <w:rPr>
           <w:rFonts w:ascii="Arial" w:hAnsi="Arial" w:cs="Arial"/>
-        </w:rPr>
-        <w:t xml:space="preserve"> Regras de negócio (validações, elegibilidade, etc.) </w:t>
+          <w:b/>
+          <w:bCs/>
+        </w:rPr>
+        <w:t xml:space="preserve"> -</w:t>
+      </w:r>
+      <w:r>
+        <w:rPr>
+          <w:rFonts w:ascii="Arial" w:hAnsi="Arial" w:cs="Arial"/>
+        </w:rPr>
+        <w:t xml:space="preserve"> Regras de negócio (validações, </w:t>
+      </w:r>
+      <w:proofErr w:type="gramStart"/>
+      <w:r>
+        <w:rPr>
+          <w:rFonts w:ascii="Arial" w:hAnsi="Arial" w:cs="Arial"/>
+        </w:rPr>
+        <w:t>elegibilidade, etc.</w:t>
+      </w:r>
+      <w:proofErr w:type="gramEnd"/>
+      <w:r>
+        <w:rPr>
+          <w:rFonts w:ascii="Arial" w:hAnsi="Arial" w:cs="Arial"/>
+        </w:rPr>
+        <w:t xml:space="preserve">) </w:t>
       </w:r>
     </w:p>
     <w:p>
@@ -1660,6 +1726,14 @@
           <w:bCs/>
         </w:rPr>
         <w:t>2000–2999</w:t>
+      </w:r>
+      <w:r>
+        <w:rPr>
+          <w:rFonts w:ascii="Arial" w:hAnsi="Arial" w:cs="Arial"/>
+          <w:b/>
+          <w:bCs/>
+        </w:rPr>
+        <w:t xml:space="preserve"> -</w:t>
       </w:r>
       <w:r>
         <w:rPr>
@@ -3897,6 +3971,7 @@
   <w:style w:type="character" w:default="1" w:styleId="Fontepargpadro">
     <w:name w:val="Default Paragraph Font"/>
     <w:uiPriority w:val="1"/>
+    <w:semiHidden/>
     <w:unhideWhenUsed/>
   </w:style>
   <w:style w:type="table" w:default="1" w:styleId="Tabelanormal">

</xml_diff>

<commit_message>
adicao - RF003 - RF004
</commit_message>
<xml_diff>
--- a/analise_requisitos_gerenciador_contas.docx
+++ b/analise_requisitos_gerenciador_contas.docx
@@ -1399,229 +1399,63 @@
           <w:b/>
           <w:bCs/>
         </w:rPr>
-        <w:t>Requisitos não funcionais</w:t>
-      </w:r>
-    </w:p>
-    <w:p>
-      <w:pPr>
-        <w:jc w:val="both"/>
-        <w:rPr>
-          <w:rFonts w:ascii="Arial" w:hAnsi="Arial" w:cs="Arial"/>
-          <w:b/>
-          <w:bCs/>
-        </w:rPr>
-      </w:pPr>
-      <w:r>
-        <w:rPr>
-          <w:rFonts w:ascii="Arial" w:hAnsi="Arial" w:cs="Arial"/>
-          <w:b/>
-          <w:bCs/>
-        </w:rPr>
-        <w:t xml:space="preserve">RNF001 – </w:t>
-      </w:r>
-      <w:proofErr w:type="spellStart"/>
-      <w:r>
-        <w:rPr>
-          <w:rFonts w:ascii="Arial" w:hAnsi="Arial" w:cs="Arial"/>
-          <w:b/>
-          <w:bCs/>
-        </w:rPr>
-        <w:t>Template</w:t>
-      </w:r>
-      <w:proofErr w:type="spellEnd"/>
-      <w:r>
-        <w:rPr>
-          <w:rFonts w:ascii="Arial" w:hAnsi="Arial" w:cs="Arial"/>
-          <w:b/>
-          <w:bCs/>
-        </w:rPr>
-        <w:t xml:space="preserve"> padrão</w:t>
-      </w:r>
-      <w:r>
-        <w:rPr>
-          <w:rFonts w:ascii="Arial" w:hAnsi="Arial" w:cs="Arial"/>
-          <w:b/>
-          <w:bCs/>
-        </w:rPr>
-        <w:t xml:space="preserve"> </w:t>
-      </w:r>
-      <w:proofErr w:type="spellStart"/>
-      <w:r>
-        <w:rPr>
-          <w:rFonts w:ascii="Arial" w:hAnsi="Arial" w:cs="Arial"/>
-          <w:b/>
-          <w:bCs/>
-        </w:rPr>
-        <w:t>dedocumentação</w:t>
-      </w:r>
-      <w:proofErr w:type="spellEnd"/>
-      <w:r>
-        <w:rPr>
-          <w:rFonts w:ascii="Arial" w:hAnsi="Arial" w:cs="Arial"/>
-          <w:b/>
-          <w:bCs/>
-        </w:rPr>
-        <w:t xml:space="preserve"> interna</w:t>
-      </w:r>
-      <w:r>
-        <w:rPr>
-          <w:rFonts w:ascii="Arial" w:hAnsi="Arial" w:cs="Arial"/>
-          <w:b/>
-          <w:bCs/>
-        </w:rPr>
-        <w:t xml:space="preserve"> de programas COBOL</w:t>
-      </w:r>
-    </w:p>
-    <w:p>
-      <w:pPr>
-        <w:jc w:val="both"/>
-        <w:rPr>
-          <w:rFonts w:ascii="Arial" w:hAnsi="Arial" w:cs="Arial"/>
-        </w:rPr>
-      </w:pPr>
-      <w:r>
-        <w:rPr>
-          <w:rFonts w:ascii="Arial" w:hAnsi="Arial" w:cs="Arial"/>
-        </w:rPr>
-        <w:t>*------------------------------------------------------------------------</w:t>
-      </w:r>
-    </w:p>
-    <w:p>
-      <w:pPr>
-        <w:jc w:val="both"/>
-        <w:rPr>
-          <w:rFonts w:ascii="Arial" w:hAnsi="Arial" w:cs="Arial"/>
-        </w:rPr>
-      </w:pPr>
-      <w:r>
-        <w:rPr>
-          <w:rFonts w:ascii="Arial" w:hAnsi="Arial" w:cs="Arial"/>
-        </w:rPr>
-        <w:t xml:space="preserve">* PROGRAMADOR: </w:t>
-      </w:r>
-      <w:r>
-        <w:rPr>
-          <w:rFonts w:ascii="Arial" w:hAnsi="Arial" w:cs="Arial"/>
-        </w:rPr>
-        <w:t>Nome do desenvolvedor.</w:t>
-      </w:r>
-    </w:p>
-    <w:p>
-      <w:pPr>
-        <w:jc w:val="both"/>
-        <w:rPr>
-          <w:rFonts w:ascii="Arial" w:hAnsi="Arial" w:cs="Arial"/>
-        </w:rPr>
-      </w:pPr>
-      <w:r>
-        <w:rPr>
-          <w:rFonts w:ascii="Arial" w:hAnsi="Arial" w:cs="Arial"/>
-        </w:rPr>
-        <w:t xml:space="preserve">* SIGLA......: </w:t>
-      </w:r>
-      <w:r>
-        <w:rPr>
-          <w:rFonts w:ascii="Arial" w:hAnsi="Arial" w:cs="Arial"/>
-        </w:rPr>
-        <w:t>Sigla – Nome da sigla (ou sistema).</w:t>
-      </w:r>
-    </w:p>
-    <w:p>
-      <w:pPr>
-        <w:jc w:val="both"/>
-        <w:rPr>
-          <w:rFonts w:ascii="Arial" w:hAnsi="Arial" w:cs="Arial"/>
-        </w:rPr>
-      </w:pPr>
-      <w:r>
-        <w:rPr>
-          <w:rFonts w:ascii="Arial" w:hAnsi="Arial" w:cs="Arial"/>
-        </w:rPr>
-        <w:t xml:space="preserve">* OBJETIVO...: </w:t>
-      </w:r>
-      <w:r>
-        <w:rPr>
-          <w:rFonts w:ascii="Arial" w:hAnsi="Arial" w:cs="Arial"/>
-        </w:rPr>
-        <w:t>Objetivo do programa.</w:t>
-      </w:r>
-    </w:p>
-    <w:p>
-      <w:pPr>
-        <w:jc w:val="both"/>
-        <w:rPr>
-          <w:rFonts w:ascii="Arial" w:hAnsi="Arial" w:cs="Arial"/>
-        </w:rPr>
-      </w:pPr>
-      <w:r>
-        <w:rPr>
-          <w:rFonts w:ascii="Arial" w:hAnsi="Arial" w:cs="Arial"/>
-        </w:rPr>
-        <w:t xml:space="preserve">* DATA DE CRIACAO: </w:t>
-      </w:r>
-      <w:r>
-        <w:rPr>
-          <w:rFonts w:ascii="Arial" w:hAnsi="Arial" w:cs="Arial"/>
-        </w:rPr>
-        <w:t>Data de criação do programa.</w:t>
-      </w:r>
-    </w:p>
-    <w:p>
-      <w:pPr>
-        <w:jc w:val="both"/>
-        <w:rPr>
-          <w:rFonts w:ascii="Arial" w:hAnsi="Arial" w:cs="Arial"/>
-        </w:rPr>
-      </w:pPr>
-      <w:r>
-        <w:rPr>
-          <w:rFonts w:ascii="Arial" w:hAnsi="Arial" w:cs="Arial"/>
-        </w:rPr>
-        <w:t>*------------------------------------------------------------------------</w:t>
-      </w:r>
-    </w:p>
-    <w:p>
-      <w:pPr>
-        <w:jc w:val="both"/>
-        <w:rPr>
-          <w:rFonts w:ascii="Arial" w:hAnsi="Arial" w:cs="Arial"/>
-          <w:b/>
-          <w:bCs/>
-        </w:rPr>
-      </w:pPr>
-    </w:p>
-    <w:p>
-      <w:pPr>
-        <w:jc w:val="both"/>
-        <w:rPr>
-          <w:rFonts w:ascii="Arial" w:hAnsi="Arial" w:cs="Arial"/>
-          <w:b/>
-          <w:bCs/>
-        </w:rPr>
-      </w:pPr>
-      <w:r>
-        <w:rPr>
-          <w:rFonts w:ascii="Arial" w:hAnsi="Arial" w:cs="Arial"/>
-          <w:b/>
-          <w:bCs/>
-        </w:rPr>
-        <w:t>RNF00</w:t>
-      </w:r>
-      <w:r>
-        <w:rPr>
-          <w:rFonts w:ascii="Arial" w:hAnsi="Arial" w:cs="Arial"/>
-          <w:b/>
-          <w:bCs/>
-        </w:rPr>
-        <w:t>2</w:t>
-      </w:r>
-      <w:r>
-        <w:rPr>
-          <w:rFonts w:ascii="Arial" w:hAnsi="Arial" w:cs="Arial"/>
-          <w:b/>
-          <w:bCs/>
-        </w:rPr>
-        <w:t xml:space="preserve"> – Padrão que deve ser adotado quanto a códigos internos dos programas</w:t>
+        <w:t>RF00</w:t>
+      </w:r>
+      <w:r>
+        <w:rPr>
+          <w:rFonts w:ascii="Arial" w:hAnsi="Arial" w:cs="Arial"/>
+          <w:b/>
+          <w:bCs/>
+        </w:rPr>
+        <w:t>3</w:t>
+      </w:r>
+      <w:r>
+        <w:rPr>
+          <w:rFonts w:ascii="Arial" w:hAnsi="Arial" w:cs="Arial"/>
+          <w:b/>
+          <w:bCs/>
+        </w:rPr>
+        <w:t xml:space="preserve"> – Permitir realizar registro de saque na conta</w:t>
+      </w:r>
+    </w:p>
+    <w:p>
+      <w:pPr>
+        <w:jc w:val="both"/>
+        <w:rPr>
+          <w:rFonts w:ascii="Arial" w:hAnsi="Arial" w:cs="Arial"/>
+        </w:rPr>
+      </w:pPr>
+      <w:r>
+        <w:rPr>
+          <w:rFonts w:ascii="Arial" w:hAnsi="Arial" w:cs="Arial"/>
+          <w:b/>
+          <w:bCs/>
+        </w:rPr>
+        <w:t xml:space="preserve">Descrição: </w:t>
+      </w:r>
+      <w:r>
+        <w:rPr>
+          <w:rFonts w:ascii="Arial" w:hAnsi="Arial" w:cs="Arial"/>
+        </w:rPr>
+        <w:t>o sistema deve possuir um módulo que realize o registro de saques na conta.</w:t>
+      </w:r>
+    </w:p>
+    <w:p>
+      <w:pPr>
+        <w:jc w:val="both"/>
+        <w:rPr>
+          <w:rFonts w:ascii="Arial" w:hAnsi="Arial" w:cs="Arial"/>
+          <w:b/>
+          <w:bCs/>
+        </w:rPr>
+      </w:pPr>
+      <w:r>
+        <w:rPr>
+          <w:rFonts w:ascii="Arial" w:hAnsi="Arial" w:cs="Arial"/>
+          <w:b/>
+          <w:bCs/>
+        </w:rPr>
+        <w:t>Pré-condição e Entrada</w:t>
       </w:r>
     </w:p>
     <w:p>
@@ -1634,27 +1468,36 @@
         <w:jc w:val="both"/>
         <w:rPr>
           <w:rFonts w:ascii="Arial" w:hAnsi="Arial" w:cs="Arial"/>
-        </w:rPr>
-      </w:pPr>
-      <w:r>
-        <w:rPr>
-          <w:rFonts w:ascii="Arial" w:hAnsi="Arial" w:cs="Arial"/>
-          <w:b/>
-          <w:bCs/>
-        </w:rPr>
-        <w:t>0000</w:t>
-      </w:r>
-      <w:r>
-        <w:rPr>
-          <w:rFonts w:ascii="Arial" w:hAnsi="Arial" w:cs="Arial"/>
-        </w:rPr>
-        <w:t xml:space="preserve"> - </w:t>
-      </w:r>
-      <w:r>
-        <w:rPr>
-          <w:rFonts w:ascii="Arial" w:hAnsi="Arial" w:cs="Arial"/>
-        </w:rPr>
-        <w:t xml:space="preserve">OK </w:t>
+          <w:b/>
+          <w:bCs/>
+        </w:rPr>
+      </w:pPr>
+      <w:r>
+        <w:rPr>
+          <w:rFonts w:ascii="Arial" w:hAnsi="Arial" w:cs="Arial"/>
+        </w:rPr>
+        <w:t>Operações a serem criadas:</w:t>
+      </w:r>
+    </w:p>
+    <w:p>
+      <w:pPr>
+        <w:pStyle w:val="PargrafodaLista"/>
+        <w:numPr>
+          <w:ilvl w:val="1"/>
+          <w:numId w:val="10"/>
+        </w:numPr>
+        <w:jc w:val="both"/>
+        <w:rPr>
+          <w:rFonts w:ascii="Arial" w:hAnsi="Arial" w:cs="Arial"/>
+          <w:b/>
+          <w:bCs/>
+        </w:rPr>
+      </w:pPr>
+      <w:r>
+        <w:rPr>
+          <w:rFonts w:ascii="Arial" w:hAnsi="Arial" w:cs="Arial"/>
+        </w:rPr>
+        <w:t>Registro de saque em determinada conta;</w:t>
       </w:r>
     </w:p>
     <w:p>
@@ -1667,6 +1510,140 @@
         <w:jc w:val="both"/>
         <w:rPr>
           <w:rFonts w:ascii="Arial" w:hAnsi="Arial" w:cs="Arial"/>
+          <w:b/>
+          <w:bCs/>
+        </w:rPr>
+      </w:pPr>
+      <w:r>
+        <w:rPr>
+          <w:rFonts w:ascii="Arial" w:hAnsi="Arial" w:cs="Arial"/>
+        </w:rPr>
+        <w:t>Dados necessários para a realização do depósito:</w:t>
+      </w:r>
+      <w:r>
+        <w:rPr>
+          <w:rFonts w:ascii="Arial" w:hAnsi="Arial" w:cs="Arial"/>
+        </w:rPr>
+        <w:tab/>
+      </w:r>
+    </w:p>
+    <w:p>
+      <w:pPr>
+        <w:pStyle w:val="PargrafodaLista"/>
+        <w:numPr>
+          <w:ilvl w:val="1"/>
+          <w:numId w:val="10"/>
+        </w:numPr>
+        <w:jc w:val="both"/>
+        <w:rPr>
+          <w:rFonts w:ascii="Arial" w:hAnsi="Arial" w:cs="Arial"/>
+          <w:b/>
+          <w:bCs/>
+        </w:rPr>
+      </w:pPr>
+      <w:r>
+        <w:rPr>
+          <w:rFonts w:ascii="Arial" w:hAnsi="Arial" w:cs="Arial"/>
+        </w:rPr>
+        <w:t>Agência;</w:t>
+      </w:r>
+    </w:p>
+    <w:p>
+      <w:pPr>
+        <w:pStyle w:val="PargrafodaLista"/>
+        <w:numPr>
+          <w:ilvl w:val="1"/>
+          <w:numId w:val="10"/>
+        </w:numPr>
+        <w:jc w:val="both"/>
+        <w:rPr>
+          <w:rFonts w:ascii="Arial" w:hAnsi="Arial" w:cs="Arial"/>
+          <w:b/>
+          <w:bCs/>
+        </w:rPr>
+      </w:pPr>
+      <w:r>
+        <w:rPr>
+          <w:rFonts w:ascii="Arial" w:hAnsi="Arial" w:cs="Arial"/>
+        </w:rPr>
+        <w:t>Conta;</w:t>
+      </w:r>
+    </w:p>
+    <w:p>
+      <w:pPr>
+        <w:pStyle w:val="PargrafodaLista"/>
+        <w:numPr>
+          <w:ilvl w:val="1"/>
+          <w:numId w:val="10"/>
+        </w:numPr>
+        <w:jc w:val="both"/>
+        <w:rPr>
+          <w:rFonts w:ascii="Arial" w:hAnsi="Arial" w:cs="Arial"/>
+          <w:b/>
+          <w:bCs/>
+        </w:rPr>
+      </w:pPr>
+      <w:r>
+        <w:rPr>
+          <w:rFonts w:ascii="Arial" w:hAnsi="Arial" w:cs="Arial"/>
+        </w:rPr>
+        <w:t>Valor do depósito;</w:t>
+      </w:r>
+    </w:p>
+    <w:p>
+      <w:pPr>
+        <w:jc w:val="both"/>
+        <w:rPr>
+          <w:rFonts w:ascii="Arial" w:hAnsi="Arial" w:cs="Arial"/>
+          <w:b/>
+          <w:bCs/>
+        </w:rPr>
+      </w:pPr>
+      <w:r>
+        <w:rPr>
+          <w:rFonts w:ascii="Arial" w:hAnsi="Arial" w:cs="Arial"/>
+          <w:b/>
+          <w:bCs/>
+        </w:rPr>
+        <w:t>Pós-condição e Saida</w:t>
+      </w:r>
+    </w:p>
+    <w:p>
+      <w:pPr>
+        <w:pStyle w:val="PargrafodaLista"/>
+        <w:numPr>
+          <w:ilvl w:val="0"/>
+          <w:numId w:val="11"/>
+        </w:numPr>
+        <w:jc w:val="both"/>
+        <w:rPr>
+          <w:rFonts w:ascii="Arial" w:hAnsi="Arial" w:cs="Arial"/>
+        </w:rPr>
+      </w:pPr>
+      <w:r>
+        <w:rPr>
+          <w:rFonts w:ascii="Arial" w:hAnsi="Arial" w:cs="Arial"/>
+        </w:rPr>
+        <w:t>Mensagem resultante da operação;</w:t>
+      </w:r>
+    </w:p>
+    <w:p>
+      <w:pPr>
+        <w:jc w:val="both"/>
+        <w:rPr>
+          <w:rFonts w:ascii="Arial" w:hAnsi="Arial" w:cs="Arial"/>
+          <w:b/>
+          <w:bCs/>
+        </w:rPr>
+      </w:pPr>
+    </w:p>
+    <w:p>
+      <w:pPr>
+        <w:jc w:val="both"/>
+        <w:rPr>
+          <w:rFonts w:ascii="Arial" w:hAnsi="Arial" w:cs="Arial"/>
+          <w:b/>
+          <w:bCs/>
         </w:rPr>
       </w:pPr>
       <w:r>
@@ -1676,6 +1653,692 @@
           <w:bCs/>
         </w:rPr>
         <w:lastRenderedPageBreak/>
+        <w:t>RF004 – Programa que permite a realização de transferências</w:t>
+      </w:r>
+      <w:r>
+        <w:rPr>
+          <w:rFonts w:ascii="Arial" w:hAnsi="Arial" w:cs="Arial"/>
+          <w:b/>
+          <w:bCs/>
+        </w:rPr>
+        <w:t xml:space="preserve"> </w:t>
+      </w:r>
+      <w:proofErr w:type="spellStart"/>
+      <w:r>
+        <w:rPr>
+          <w:rFonts w:ascii="Arial" w:hAnsi="Arial" w:cs="Arial"/>
+          <w:b/>
+          <w:bCs/>
+        </w:rPr>
+        <w:t>intrabancárias</w:t>
+      </w:r>
+      <w:proofErr w:type="spellEnd"/>
+      <w:r>
+        <w:rPr>
+          <w:rFonts w:ascii="Arial" w:hAnsi="Arial" w:cs="Arial"/>
+          <w:b/>
+          <w:bCs/>
+        </w:rPr>
+        <w:t xml:space="preserve"> </w:t>
+      </w:r>
+      <w:r>
+        <w:rPr>
+          <w:rFonts w:ascii="Arial" w:hAnsi="Arial" w:cs="Arial"/>
+          <w:b/>
+          <w:bCs/>
+        </w:rPr>
+        <w:t>(</w:t>
+      </w:r>
+      <w:r>
+        <w:rPr>
+          <w:rFonts w:ascii="Arial" w:hAnsi="Arial" w:cs="Arial"/>
+          <w:b/>
+          <w:bCs/>
+        </w:rPr>
+        <w:t>internas</w:t>
+      </w:r>
+      <w:r>
+        <w:rPr>
+          <w:rFonts w:ascii="Arial" w:hAnsi="Arial" w:cs="Arial"/>
+          <w:b/>
+          <w:bCs/>
+        </w:rPr>
+        <w:t>)</w:t>
+      </w:r>
+      <w:r>
+        <w:rPr>
+          <w:rFonts w:ascii="Arial" w:hAnsi="Arial" w:cs="Arial"/>
+          <w:b/>
+          <w:bCs/>
+        </w:rPr>
+        <w:t xml:space="preserve"> –</w:t>
+      </w:r>
+      <w:r>
+        <w:rPr>
+          <w:rFonts w:ascii="Arial" w:hAnsi="Arial" w:cs="Arial"/>
+          <w:b/>
+          <w:bCs/>
+        </w:rPr>
+        <w:t xml:space="preserve"> Cliente interno para cliente interno </w:t>
+      </w:r>
+      <w:r>
+        <w:rPr>
+          <w:rFonts w:ascii="Arial" w:hAnsi="Arial" w:cs="Arial"/>
+          <w:b/>
+          <w:bCs/>
+        </w:rPr>
+        <w:t>do banco</w:t>
+      </w:r>
+    </w:p>
+    <w:p>
+      <w:pPr>
+        <w:jc w:val="both"/>
+        <w:rPr>
+          <w:rFonts w:ascii="Arial" w:hAnsi="Arial" w:cs="Arial"/>
+        </w:rPr>
+      </w:pPr>
+      <w:r>
+        <w:rPr>
+          <w:rFonts w:ascii="Arial" w:hAnsi="Arial" w:cs="Arial"/>
+          <w:b/>
+          <w:bCs/>
+        </w:rPr>
+        <w:t xml:space="preserve">Descrição: </w:t>
+      </w:r>
+      <w:r>
+        <w:rPr>
+          <w:rFonts w:ascii="Arial" w:hAnsi="Arial" w:cs="Arial"/>
+        </w:rPr>
+        <w:t>o sistema deve possuir um programa que realize a transferência de valores entre contas cadastradas no banco.</w:t>
+      </w:r>
+    </w:p>
+    <w:p>
+      <w:pPr>
+        <w:jc w:val="both"/>
+        <w:rPr>
+          <w:rFonts w:ascii="Arial" w:hAnsi="Arial" w:cs="Arial"/>
+          <w:b/>
+          <w:bCs/>
+        </w:rPr>
+      </w:pPr>
+      <w:r>
+        <w:rPr>
+          <w:rFonts w:ascii="Arial" w:hAnsi="Arial" w:cs="Arial"/>
+          <w:b/>
+          <w:bCs/>
+        </w:rPr>
+        <w:t>Pré-condição</w:t>
+      </w:r>
+    </w:p>
+    <w:p>
+      <w:pPr>
+        <w:pStyle w:val="PargrafodaLista"/>
+        <w:numPr>
+          <w:ilvl w:val="0"/>
+          <w:numId w:val="11"/>
+        </w:numPr>
+        <w:jc w:val="both"/>
+        <w:rPr>
+          <w:rFonts w:ascii="Arial" w:hAnsi="Arial" w:cs="Arial"/>
+          <w:b/>
+          <w:bCs/>
+        </w:rPr>
+      </w:pPr>
+      <w:r>
+        <w:rPr>
+          <w:rFonts w:ascii="Arial" w:hAnsi="Arial" w:cs="Arial"/>
+        </w:rPr>
+        <w:t>Operações a serem criadas:</w:t>
+      </w:r>
+    </w:p>
+    <w:p>
+      <w:pPr>
+        <w:pStyle w:val="PargrafodaLista"/>
+        <w:numPr>
+          <w:ilvl w:val="1"/>
+          <w:numId w:val="11"/>
+        </w:numPr>
+        <w:jc w:val="both"/>
+        <w:rPr>
+          <w:rFonts w:ascii="Arial" w:hAnsi="Arial" w:cs="Arial"/>
+          <w:b/>
+          <w:bCs/>
+        </w:rPr>
+      </w:pPr>
+      <w:r>
+        <w:rPr>
+          <w:rFonts w:ascii="Arial" w:hAnsi="Arial" w:cs="Arial"/>
+        </w:rPr>
+        <w:t>Transferência de valor entre contas cadastradas no próprio banco;</w:t>
+      </w:r>
+    </w:p>
+    <w:p>
+      <w:pPr>
+        <w:pStyle w:val="PargrafodaLista"/>
+        <w:numPr>
+          <w:ilvl w:val="2"/>
+          <w:numId w:val="11"/>
+        </w:numPr>
+        <w:jc w:val="both"/>
+        <w:rPr>
+          <w:rFonts w:ascii="Arial" w:hAnsi="Arial" w:cs="Arial"/>
+          <w:b/>
+          <w:bCs/>
+        </w:rPr>
+      </w:pPr>
+      <w:r>
+        <w:rPr>
+          <w:rFonts w:ascii="Arial" w:hAnsi="Arial" w:cs="Arial"/>
+        </w:rPr>
+        <w:t>De cliente interno para cliente interno;</w:t>
+      </w:r>
+    </w:p>
+    <w:p>
+      <w:pPr>
+        <w:pStyle w:val="PargrafodaLista"/>
+        <w:numPr>
+          <w:ilvl w:val="0"/>
+          <w:numId w:val="11"/>
+        </w:numPr>
+        <w:jc w:val="both"/>
+        <w:rPr>
+          <w:rFonts w:ascii="Arial" w:hAnsi="Arial" w:cs="Arial"/>
+          <w:b/>
+          <w:bCs/>
+        </w:rPr>
+      </w:pPr>
+      <w:r>
+        <w:rPr>
+          <w:rFonts w:ascii="Arial" w:hAnsi="Arial" w:cs="Arial"/>
+        </w:rPr>
+        <w:t>Dados de entrada necessários:</w:t>
+      </w:r>
+    </w:p>
+    <w:p>
+      <w:pPr>
+        <w:pStyle w:val="PargrafodaLista"/>
+        <w:numPr>
+          <w:ilvl w:val="1"/>
+          <w:numId w:val="11"/>
+        </w:numPr>
+        <w:jc w:val="both"/>
+        <w:rPr>
+          <w:rFonts w:ascii="Arial" w:hAnsi="Arial" w:cs="Arial"/>
+          <w:b/>
+          <w:bCs/>
+        </w:rPr>
+      </w:pPr>
+      <w:r>
+        <w:rPr>
+          <w:rFonts w:ascii="Arial" w:hAnsi="Arial" w:cs="Arial"/>
+        </w:rPr>
+        <w:t>Cliente ordenante:</w:t>
+      </w:r>
+    </w:p>
+    <w:p>
+      <w:pPr>
+        <w:pStyle w:val="PargrafodaLista"/>
+        <w:numPr>
+          <w:ilvl w:val="2"/>
+          <w:numId w:val="11"/>
+        </w:numPr>
+        <w:jc w:val="both"/>
+        <w:rPr>
+          <w:rFonts w:ascii="Arial" w:hAnsi="Arial" w:cs="Arial"/>
+          <w:b/>
+          <w:bCs/>
+        </w:rPr>
+      </w:pPr>
+      <w:r>
+        <w:rPr>
+          <w:rFonts w:ascii="Arial" w:hAnsi="Arial" w:cs="Arial"/>
+        </w:rPr>
+        <w:t>Agência;</w:t>
+      </w:r>
+    </w:p>
+    <w:p>
+      <w:pPr>
+        <w:pStyle w:val="PargrafodaLista"/>
+        <w:numPr>
+          <w:ilvl w:val="2"/>
+          <w:numId w:val="11"/>
+        </w:numPr>
+        <w:jc w:val="both"/>
+        <w:rPr>
+          <w:rFonts w:ascii="Arial" w:hAnsi="Arial" w:cs="Arial"/>
+          <w:b/>
+          <w:bCs/>
+        </w:rPr>
+      </w:pPr>
+      <w:r>
+        <w:rPr>
+          <w:rFonts w:ascii="Arial" w:hAnsi="Arial" w:cs="Arial"/>
+        </w:rPr>
+        <w:t>Conta;</w:t>
+      </w:r>
+    </w:p>
+    <w:p>
+      <w:pPr>
+        <w:pStyle w:val="PargrafodaLista"/>
+        <w:numPr>
+          <w:ilvl w:val="2"/>
+          <w:numId w:val="11"/>
+        </w:numPr>
+        <w:jc w:val="both"/>
+        <w:rPr>
+          <w:rFonts w:ascii="Arial" w:hAnsi="Arial" w:cs="Arial"/>
+          <w:b/>
+          <w:bCs/>
+        </w:rPr>
+      </w:pPr>
+      <w:r>
+        <w:rPr>
+          <w:rFonts w:ascii="Arial" w:hAnsi="Arial" w:cs="Arial"/>
+        </w:rPr>
+        <w:t>Valor;</w:t>
+      </w:r>
+    </w:p>
+    <w:p>
+      <w:pPr>
+        <w:pStyle w:val="PargrafodaLista"/>
+        <w:numPr>
+          <w:ilvl w:val="1"/>
+          <w:numId w:val="11"/>
+        </w:numPr>
+        <w:jc w:val="both"/>
+        <w:rPr>
+          <w:rFonts w:ascii="Arial" w:hAnsi="Arial" w:cs="Arial"/>
+          <w:b/>
+          <w:bCs/>
+        </w:rPr>
+      </w:pPr>
+      <w:r>
+        <w:rPr>
+          <w:rFonts w:ascii="Arial" w:hAnsi="Arial" w:cs="Arial"/>
+        </w:rPr>
+        <w:t>Cliente beneficiário:</w:t>
+      </w:r>
+    </w:p>
+    <w:p>
+      <w:pPr>
+        <w:pStyle w:val="PargrafodaLista"/>
+        <w:numPr>
+          <w:ilvl w:val="2"/>
+          <w:numId w:val="11"/>
+        </w:numPr>
+        <w:jc w:val="both"/>
+        <w:rPr>
+          <w:rFonts w:ascii="Arial" w:hAnsi="Arial" w:cs="Arial"/>
+          <w:b/>
+          <w:bCs/>
+        </w:rPr>
+      </w:pPr>
+      <w:r>
+        <w:rPr>
+          <w:rFonts w:ascii="Arial" w:hAnsi="Arial" w:cs="Arial"/>
+        </w:rPr>
+        <w:t>Agência;</w:t>
+      </w:r>
+    </w:p>
+    <w:p>
+      <w:pPr>
+        <w:pStyle w:val="PargrafodaLista"/>
+        <w:numPr>
+          <w:ilvl w:val="2"/>
+          <w:numId w:val="11"/>
+        </w:numPr>
+        <w:jc w:val="both"/>
+        <w:rPr>
+          <w:rFonts w:ascii="Arial" w:hAnsi="Arial" w:cs="Arial"/>
+          <w:b/>
+          <w:bCs/>
+        </w:rPr>
+      </w:pPr>
+      <w:r>
+        <w:rPr>
+          <w:rFonts w:ascii="Arial" w:hAnsi="Arial" w:cs="Arial"/>
+        </w:rPr>
+        <w:t>Conta;</w:t>
+      </w:r>
+    </w:p>
+    <w:p>
+      <w:pPr>
+        <w:jc w:val="both"/>
+        <w:rPr>
+          <w:rFonts w:ascii="Arial" w:hAnsi="Arial" w:cs="Arial"/>
+          <w:b/>
+          <w:bCs/>
+        </w:rPr>
+      </w:pPr>
+      <w:r>
+        <w:rPr>
+          <w:rFonts w:ascii="Arial" w:hAnsi="Arial" w:cs="Arial"/>
+          <w:b/>
+          <w:bCs/>
+        </w:rPr>
+        <w:t>Pós-condição e Saída</w:t>
+      </w:r>
+    </w:p>
+    <w:p>
+      <w:pPr>
+        <w:pStyle w:val="PargrafodaLista"/>
+        <w:numPr>
+          <w:ilvl w:val="0"/>
+          <w:numId w:val="12"/>
+        </w:numPr>
+        <w:jc w:val="both"/>
+        <w:rPr>
+          <w:rFonts w:ascii="Arial" w:hAnsi="Arial" w:cs="Arial"/>
+        </w:rPr>
+      </w:pPr>
+      <w:r>
+        <w:rPr>
+          <w:rFonts w:ascii="Arial" w:hAnsi="Arial" w:cs="Arial"/>
+        </w:rPr>
+        <w:t>Mensagem resultante da operação;</w:t>
+      </w:r>
+    </w:p>
+    <w:p>
+      <w:pPr>
+        <w:jc w:val="both"/>
+        <w:rPr>
+          <w:rFonts w:ascii="Arial" w:hAnsi="Arial" w:cs="Arial"/>
+          <w:b/>
+          <w:bCs/>
+        </w:rPr>
+      </w:pPr>
+    </w:p>
+    <w:p>
+      <w:pPr>
+        <w:jc w:val="both"/>
+        <w:rPr>
+          <w:rFonts w:ascii="Arial" w:hAnsi="Arial" w:cs="Arial"/>
+          <w:b/>
+          <w:bCs/>
+        </w:rPr>
+      </w:pPr>
+      <w:r>
+        <w:rPr>
+          <w:rFonts w:ascii="Arial" w:hAnsi="Arial" w:cs="Arial"/>
+          <w:b/>
+          <w:bCs/>
+        </w:rPr>
+        <w:t>Requisitos não funcionais</w:t>
+      </w:r>
+    </w:p>
+    <w:p>
+      <w:pPr>
+        <w:jc w:val="both"/>
+        <w:rPr>
+          <w:rFonts w:ascii="Arial" w:hAnsi="Arial" w:cs="Arial"/>
+          <w:b/>
+          <w:bCs/>
+        </w:rPr>
+      </w:pPr>
+      <w:r>
+        <w:rPr>
+          <w:rFonts w:ascii="Arial" w:hAnsi="Arial" w:cs="Arial"/>
+          <w:b/>
+          <w:bCs/>
+        </w:rPr>
+        <w:t xml:space="preserve">RNF001 – </w:t>
+      </w:r>
+      <w:proofErr w:type="spellStart"/>
+      <w:r>
+        <w:rPr>
+          <w:rFonts w:ascii="Arial" w:hAnsi="Arial" w:cs="Arial"/>
+          <w:b/>
+          <w:bCs/>
+        </w:rPr>
+        <w:t>Template</w:t>
+      </w:r>
+      <w:proofErr w:type="spellEnd"/>
+      <w:r>
+        <w:rPr>
+          <w:rFonts w:ascii="Arial" w:hAnsi="Arial" w:cs="Arial"/>
+          <w:b/>
+          <w:bCs/>
+        </w:rPr>
+        <w:t xml:space="preserve"> padrão</w:t>
+      </w:r>
+      <w:r>
+        <w:rPr>
+          <w:rFonts w:ascii="Arial" w:hAnsi="Arial" w:cs="Arial"/>
+          <w:b/>
+          <w:bCs/>
+        </w:rPr>
+        <w:t xml:space="preserve"> </w:t>
+      </w:r>
+      <w:proofErr w:type="spellStart"/>
+      <w:r>
+        <w:rPr>
+          <w:rFonts w:ascii="Arial" w:hAnsi="Arial" w:cs="Arial"/>
+          <w:b/>
+          <w:bCs/>
+        </w:rPr>
+        <w:t>dedocumentação</w:t>
+      </w:r>
+      <w:proofErr w:type="spellEnd"/>
+      <w:r>
+        <w:rPr>
+          <w:rFonts w:ascii="Arial" w:hAnsi="Arial" w:cs="Arial"/>
+          <w:b/>
+          <w:bCs/>
+        </w:rPr>
+        <w:t xml:space="preserve"> interna</w:t>
+      </w:r>
+      <w:r>
+        <w:rPr>
+          <w:rFonts w:ascii="Arial" w:hAnsi="Arial" w:cs="Arial"/>
+          <w:b/>
+          <w:bCs/>
+        </w:rPr>
+        <w:t xml:space="preserve"> de programas COBOL</w:t>
+      </w:r>
+    </w:p>
+    <w:p>
+      <w:pPr>
+        <w:jc w:val="both"/>
+        <w:rPr>
+          <w:rFonts w:ascii="Arial" w:hAnsi="Arial" w:cs="Arial"/>
+        </w:rPr>
+      </w:pPr>
+      <w:r>
+        <w:rPr>
+          <w:rFonts w:ascii="Arial" w:hAnsi="Arial" w:cs="Arial"/>
+        </w:rPr>
+        <w:t>*------------------------------------------------------------------------</w:t>
+      </w:r>
+    </w:p>
+    <w:p>
+      <w:pPr>
+        <w:jc w:val="both"/>
+        <w:rPr>
+          <w:rFonts w:ascii="Arial" w:hAnsi="Arial" w:cs="Arial"/>
+        </w:rPr>
+      </w:pPr>
+      <w:r>
+        <w:rPr>
+          <w:rFonts w:ascii="Arial" w:hAnsi="Arial" w:cs="Arial"/>
+        </w:rPr>
+        <w:t xml:space="preserve">* PROGRAMADOR: </w:t>
+      </w:r>
+      <w:r>
+        <w:rPr>
+          <w:rFonts w:ascii="Arial" w:hAnsi="Arial" w:cs="Arial"/>
+        </w:rPr>
+        <w:t>Nome do desenvolvedor.</w:t>
+      </w:r>
+    </w:p>
+    <w:p>
+      <w:pPr>
+        <w:jc w:val="both"/>
+        <w:rPr>
+          <w:rFonts w:ascii="Arial" w:hAnsi="Arial" w:cs="Arial"/>
+        </w:rPr>
+      </w:pPr>
+      <w:r>
+        <w:rPr>
+          <w:rFonts w:ascii="Arial" w:hAnsi="Arial" w:cs="Arial"/>
+        </w:rPr>
+        <w:t xml:space="preserve">* SIGLA......: </w:t>
+      </w:r>
+      <w:r>
+        <w:rPr>
+          <w:rFonts w:ascii="Arial" w:hAnsi="Arial" w:cs="Arial"/>
+        </w:rPr>
+        <w:t>Sigla – Nome da sigla (ou sistema).</w:t>
+      </w:r>
+    </w:p>
+    <w:p>
+      <w:pPr>
+        <w:jc w:val="both"/>
+        <w:rPr>
+          <w:rFonts w:ascii="Arial" w:hAnsi="Arial" w:cs="Arial"/>
+        </w:rPr>
+      </w:pPr>
+      <w:r>
+        <w:rPr>
+          <w:rFonts w:ascii="Arial" w:hAnsi="Arial" w:cs="Arial"/>
+        </w:rPr>
+        <w:t xml:space="preserve">* OBJETIVO...: </w:t>
+      </w:r>
+      <w:r>
+        <w:rPr>
+          <w:rFonts w:ascii="Arial" w:hAnsi="Arial" w:cs="Arial"/>
+        </w:rPr>
+        <w:t>Objetivo do programa.</w:t>
+      </w:r>
+    </w:p>
+    <w:p>
+      <w:pPr>
+        <w:jc w:val="both"/>
+        <w:rPr>
+          <w:rFonts w:ascii="Arial" w:hAnsi="Arial" w:cs="Arial"/>
+        </w:rPr>
+      </w:pPr>
+      <w:r>
+        <w:rPr>
+          <w:rFonts w:ascii="Arial" w:hAnsi="Arial" w:cs="Arial"/>
+        </w:rPr>
+        <w:t xml:space="preserve">* DATA DE CRIACAO: </w:t>
+      </w:r>
+      <w:r>
+        <w:rPr>
+          <w:rFonts w:ascii="Arial" w:hAnsi="Arial" w:cs="Arial"/>
+        </w:rPr>
+        <w:t>Data de criação do programa.</w:t>
+      </w:r>
+    </w:p>
+    <w:p>
+      <w:pPr>
+        <w:jc w:val="both"/>
+        <w:rPr>
+          <w:rFonts w:ascii="Arial" w:hAnsi="Arial" w:cs="Arial"/>
+        </w:rPr>
+      </w:pPr>
+      <w:r>
+        <w:rPr>
+          <w:rFonts w:ascii="Arial" w:hAnsi="Arial" w:cs="Arial"/>
+        </w:rPr>
+        <w:t>*------------------------------------------------------------------------</w:t>
+      </w:r>
+    </w:p>
+    <w:p>
+      <w:pPr>
+        <w:jc w:val="both"/>
+        <w:rPr>
+          <w:rFonts w:ascii="Arial" w:hAnsi="Arial" w:cs="Arial"/>
+          <w:b/>
+          <w:bCs/>
+        </w:rPr>
+      </w:pPr>
+    </w:p>
+    <w:p>
+      <w:pPr>
+        <w:jc w:val="both"/>
+        <w:rPr>
+          <w:rFonts w:ascii="Arial" w:hAnsi="Arial" w:cs="Arial"/>
+          <w:b/>
+          <w:bCs/>
+        </w:rPr>
+      </w:pPr>
+      <w:r>
+        <w:rPr>
+          <w:rFonts w:ascii="Arial" w:hAnsi="Arial" w:cs="Arial"/>
+          <w:b/>
+          <w:bCs/>
+        </w:rPr>
+        <w:t>RNF00</w:t>
+      </w:r>
+      <w:r>
+        <w:rPr>
+          <w:rFonts w:ascii="Arial" w:hAnsi="Arial" w:cs="Arial"/>
+          <w:b/>
+          <w:bCs/>
+        </w:rPr>
+        <w:t>2</w:t>
+      </w:r>
+      <w:r>
+        <w:rPr>
+          <w:rFonts w:ascii="Arial" w:hAnsi="Arial" w:cs="Arial"/>
+          <w:b/>
+          <w:bCs/>
+        </w:rPr>
+        <w:t xml:space="preserve"> – Padrão que deve ser adotado quanto a códigos internos dos programas</w:t>
+      </w:r>
+    </w:p>
+    <w:p>
+      <w:pPr>
+        <w:pStyle w:val="PargrafodaLista"/>
+        <w:numPr>
+          <w:ilvl w:val="0"/>
+          <w:numId w:val="10"/>
+        </w:numPr>
+        <w:jc w:val="both"/>
+        <w:rPr>
+          <w:rFonts w:ascii="Arial" w:hAnsi="Arial" w:cs="Arial"/>
+        </w:rPr>
+      </w:pPr>
+      <w:r>
+        <w:rPr>
+          <w:rFonts w:ascii="Arial" w:hAnsi="Arial" w:cs="Arial"/>
+          <w:b/>
+          <w:bCs/>
+        </w:rPr>
+        <w:t>0000</w:t>
+      </w:r>
+      <w:r>
+        <w:rPr>
+          <w:rFonts w:ascii="Arial" w:hAnsi="Arial" w:cs="Arial"/>
+        </w:rPr>
+        <w:t xml:space="preserve"> - </w:t>
+      </w:r>
+      <w:r>
+        <w:rPr>
+          <w:rFonts w:ascii="Arial" w:hAnsi="Arial" w:cs="Arial"/>
+        </w:rPr>
+        <w:t xml:space="preserve">OK </w:t>
+      </w:r>
+    </w:p>
+    <w:p>
+      <w:pPr>
+        <w:pStyle w:val="PargrafodaLista"/>
+        <w:numPr>
+          <w:ilvl w:val="0"/>
+          <w:numId w:val="10"/>
+        </w:numPr>
+        <w:jc w:val="both"/>
+        <w:rPr>
+          <w:rFonts w:ascii="Arial" w:hAnsi="Arial" w:cs="Arial"/>
+        </w:rPr>
+      </w:pPr>
+      <w:r>
+        <w:rPr>
+          <w:rFonts w:ascii="Arial" w:hAnsi="Arial" w:cs="Arial"/>
+          <w:b/>
+          <w:bCs/>
+        </w:rPr>
         <w:t>1000–1999</w:t>
       </w:r>
       <w:r>
@@ -2235,7 +2898,7 @@
   <w:abstractNum w:abstractNumId="0" w15:restartNumberingAfterBreak="0">
     <w:nsid w:val="0B480310"/>
     <w:multiLevelType w:val="hybridMultilevel"/>
-    <w:tmpl w:val="13D09A38"/>
+    <w:tmpl w:val="9342EE08"/>
     <w:lvl w:ilvl="0" w:tplc="04160001">
       <w:start w:val="1"/>
       <w:numFmt w:val="bullet"/>
@@ -2248,7 +2911,7 @@
         <w:rFonts w:ascii="Symbol" w:hAnsi="Symbol" w:hint="default"/>
       </w:rPr>
     </w:lvl>
-    <w:lvl w:ilvl="1" w:tplc="04160003" w:tentative="1">
+    <w:lvl w:ilvl="1" w:tplc="04160003">
       <w:start w:val="1"/>
       <w:numFmt w:val="bullet"/>
       <w:lvlText w:val="o"/>
@@ -2798,6 +3461,119 @@
     </w:lvl>
   </w:abstractNum>
   <w:abstractNum w:abstractNumId="5" w15:restartNumberingAfterBreak="0">
+    <w:nsid w:val="28335515"/>
+    <w:multiLevelType w:val="hybridMultilevel"/>
+    <w:tmpl w:val="262CB26E"/>
+    <w:lvl w:ilvl="0" w:tplc="04160001">
+      <w:start w:val="1"/>
+      <w:numFmt w:val="bullet"/>
+      <w:lvlText w:val=""/>
+      <w:lvlJc w:val="left"/>
+      <w:pPr>
+        <w:ind w:left="720" w:hanging="360"/>
+      </w:pPr>
+      <w:rPr>
+        <w:rFonts w:ascii="Symbol" w:hAnsi="Symbol" w:hint="default"/>
+      </w:rPr>
+    </w:lvl>
+    <w:lvl w:ilvl="1" w:tplc="04160003">
+      <w:start w:val="1"/>
+      <w:numFmt w:val="bullet"/>
+      <w:lvlText w:val="o"/>
+      <w:lvlJc w:val="left"/>
+      <w:pPr>
+        <w:ind w:left="1440" w:hanging="360"/>
+      </w:pPr>
+      <w:rPr>
+        <w:rFonts w:ascii="Courier New" w:hAnsi="Courier New" w:cs="Courier New" w:hint="default"/>
+      </w:rPr>
+    </w:lvl>
+    <w:lvl w:ilvl="2" w:tplc="04160005">
+      <w:start w:val="1"/>
+      <w:numFmt w:val="bullet"/>
+      <w:lvlText w:val=""/>
+      <w:lvlJc w:val="left"/>
+      <w:pPr>
+        <w:ind w:left="2160" w:hanging="360"/>
+      </w:pPr>
+      <w:rPr>
+        <w:rFonts w:ascii="Wingdings" w:hAnsi="Wingdings" w:hint="default"/>
+      </w:rPr>
+    </w:lvl>
+    <w:lvl w:ilvl="3" w:tplc="04160001" w:tentative="1">
+      <w:start w:val="1"/>
+      <w:numFmt w:val="bullet"/>
+      <w:lvlText w:val=""/>
+      <w:lvlJc w:val="left"/>
+      <w:pPr>
+        <w:ind w:left="2880" w:hanging="360"/>
+      </w:pPr>
+      <w:rPr>
+        <w:rFonts w:ascii="Symbol" w:hAnsi="Symbol" w:hint="default"/>
+      </w:rPr>
+    </w:lvl>
+    <w:lvl w:ilvl="4" w:tplc="04160003" w:tentative="1">
+      <w:start w:val="1"/>
+      <w:numFmt w:val="bullet"/>
+      <w:lvlText w:val="o"/>
+      <w:lvlJc w:val="left"/>
+      <w:pPr>
+        <w:ind w:left="3600" w:hanging="360"/>
+      </w:pPr>
+      <w:rPr>
+        <w:rFonts w:ascii="Courier New" w:hAnsi="Courier New" w:cs="Courier New" w:hint="default"/>
+      </w:rPr>
+    </w:lvl>
+    <w:lvl w:ilvl="5" w:tplc="04160005" w:tentative="1">
+      <w:start w:val="1"/>
+      <w:numFmt w:val="bullet"/>
+      <w:lvlText w:val=""/>
+      <w:lvlJc w:val="left"/>
+      <w:pPr>
+        <w:ind w:left="4320" w:hanging="360"/>
+      </w:pPr>
+      <w:rPr>
+        <w:rFonts w:ascii="Wingdings" w:hAnsi="Wingdings" w:hint="default"/>
+      </w:rPr>
+    </w:lvl>
+    <w:lvl w:ilvl="6" w:tplc="04160001" w:tentative="1">
+      <w:start w:val="1"/>
+      <w:numFmt w:val="bullet"/>
+      <w:lvlText w:val=""/>
+      <w:lvlJc w:val="left"/>
+      <w:pPr>
+        <w:ind w:left="5040" w:hanging="360"/>
+      </w:pPr>
+      <w:rPr>
+        <w:rFonts w:ascii="Symbol" w:hAnsi="Symbol" w:hint="default"/>
+      </w:rPr>
+    </w:lvl>
+    <w:lvl w:ilvl="7" w:tplc="04160003" w:tentative="1">
+      <w:start w:val="1"/>
+      <w:numFmt w:val="bullet"/>
+      <w:lvlText w:val="o"/>
+      <w:lvlJc w:val="left"/>
+      <w:pPr>
+        <w:ind w:left="5760" w:hanging="360"/>
+      </w:pPr>
+      <w:rPr>
+        <w:rFonts w:ascii="Courier New" w:hAnsi="Courier New" w:cs="Courier New" w:hint="default"/>
+      </w:rPr>
+    </w:lvl>
+    <w:lvl w:ilvl="8" w:tplc="04160005" w:tentative="1">
+      <w:start w:val="1"/>
+      <w:numFmt w:val="bullet"/>
+      <w:lvlText w:val=""/>
+      <w:lvlJc w:val="left"/>
+      <w:pPr>
+        <w:ind w:left="6480" w:hanging="360"/>
+      </w:pPr>
+      <w:rPr>
+        <w:rFonts w:ascii="Wingdings" w:hAnsi="Wingdings" w:hint="default"/>
+      </w:rPr>
+    </w:lvl>
+  </w:abstractNum>
+  <w:abstractNum w:abstractNumId="6" w15:restartNumberingAfterBreak="0">
     <w:nsid w:val="39233323"/>
     <w:multiLevelType w:val="hybridMultilevel"/>
     <w:tmpl w:val="FF90F1BE"/>
@@ -2910,7 +3686,120 @@
       </w:rPr>
     </w:lvl>
   </w:abstractNum>
-  <w:abstractNum w:abstractNumId="6" w15:restartNumberingAfterBreak="0">
+  <w:abstractNum w:abstractNumId="7" w15:restartNumberingAfterBreak="0">
+    <w:nsid w:val="3A4B048F"/>
+    <w:multiLevelType w:val="hybridMultilevel"/>
+    <w:tmpl w:val="287ED59A"/>
+    <w:lvl w:ilvl="0" w:tplc="04160001">
+      <w:start w:val="1"/>
+      <w:numFmt w:val="bullet"/>
+      <w:lvlText w:val=""/>
+      <w:lvlJc w:val="left"/>
+      <w:pPr>
+        <w:ind w:left="720" w:hanging="360"/>
+      </w:pPr>
+      <w:rPr>
+        <w:rFonts w:ascii="Symbol" w:hAnsi="Symbol" w:hint="default"/>
+      </w:rPr>
+    </w:lvl>
+    <w:lvl w:ilvl="1" w:tplc="04160003" w:tentative="1">
+      <w:start w:val="1"/>
+      <w:numFmt w:val="bullet"/>
+      <w:lvlText w:val="o"/>
+      <w:lvlJc w:val="left"/>
+      <w:pPr>
+        <w:ind w:left="1440" w:hanging="360"/>
+      </w:pPr>
+      <w:rPr>
+        <w:rFonts w:ascii="Courier New" w:hAnsi="Courier New" w:cs="Courier New" w:hint="default"/>
+      </w:rPr>
+    </w:lvl>
+    <w:lvl w:ilvl="2" w:tplc="04160005" w:tentative="1">
+      <w:start w:val="1"/>
+      <w:numFmt w:val="bullet"/>
+      <w:lvlText w:val=""/>
+      <w:lvlJc w:val="left"/>
+      <w:pPr>
+        <w:ind w:left="2160" w:hanging="360"/>
+      </w:pPr>
+      <w:rPr>
+        <w:rFonts w:ascii="Wingdings" w:hAnsi="Wingdings" w:hint="default"/>
+      </w:rPr>
+    </w:lvl>
+    <w:lvl w:ilvl="3" w:tplc="04160001" w:tentative="1">
+      <w:start w:val="1"/>
+      <w:numFmt w:val="bullet"/>
+      <w:lvlText w:val=""/>
+      <w:lvlJc w:val="left"/>
+      <w:pPr>
+        <w:ind w:left="2880" w:hanging="360"/>
+      </w:pPr>
+      <w:rPr>
+        <w:rFonts w:ascii="Symbol" w:hAnsi="Symbol" w:hint="default"/>
+      </w:rPr>
+    </w:lvl>
+    <w:lvl w:ilvl="4" w:tplc="04160003" w:tentative="1">
+      <w:start w:val="1"/>
+      <w:numFmt w:val="bullet"/>
+      <w:lvlText w:val="o"/>
+      <w:lvlJc w:val="left"/>
+      <w:pPr>
+        <w:ind w:left="3600" w:hanging="360"/>
+      </w:pPr>
+      <w:rPr>
+        <w:rFonts w:ascii="Courier New" w:hAnsi="Courier New" w:cs="Courier New" w:hint="default"/>
+      </w:rPr>
+    </w:lvl>
+    <w:lvl w:ilvl="5" w:tplc="04160005" w:tentative="1">
+      <w:start w:val="1"/>
+      <w:numFmt w:val="bullet"/>
+      <w:lvlText w:val=""/>
+      <w:lvlJc w:val="left"/>
+      <w:pPr>
+        <w:ind w:left="4320" w:hanging="360"/>
+      </w:pPr>
+      <w:rPr>
+        <w:rFonts w:ascii="Wingdings" w:hAnsi="Wingdings" w:hint="default"/>
+      </w:rPr>
+    </w:lvl>
+    <w:lvl w:ilvl="6" w:tplc="04160001" w:tentative="1">
+      <w:start w:val="1"/>
+      <w:numFmt w:val="bullet"/>
+      <w:lvlText w:val=""/>
+      <w:lvlJc w:val="left"/>
+      <w:pPr>
+        <w:ind w:left="5040" w:hanging="360"/>
+      </w:pPr>
+      <w:rPr>
+        <w:rFonts w:ascii="Symbol" w:hAnsi="Symbol" w:hint="default"/>
+      </w:rPr>
+    </w:lvl>
+    <w:lvl w:ilvl="7" w:tplc="04160003" w:tentative="1">
+      <w:start w:val="1"/>
+      <w:numFmt w:val="bullet"/>
+      <w:lvlText w:val="o"/>
+      <w:lvlJc w:val="left"/>
+      <w:pPr>
+        <w:ind w:left="5760" w:hanging="360"/>
+      </w:pPr>
+      <w:rPr>
+        <w:rFonts w:ascii="Courier New" w:hAnsi="Courier New" w:cs="Courier New" w:hint="default"/>
+      </w:rPr>
+    </w:lvl>
+    <w:lvl w:ilvl="8" w:tplc="04160005" w:tentative="1">
+      <w:start w:val="1"/>
+      <w:numFmt w:val="bullet"/>
+      <w:lvlText w:val=""/>
+      <w:lvlJc w:val="left"/>
+      <w:pPr>
+        <w:ind w:left="6480" w:hanging="360"/>
+      </w:pPr>
+      <w:rPr>
+        <w:rFonts w:ascii="Wingdings" w:hAnsi="Wingdings" w:hint="default"/>
+      </w:rPr>
+    </w:lvl>
+  </w:abstractNum>
+  <w:abstractNum w:abstractNumId="8" w15:restartNumberingAfterBreak="0">
     <w:nsid w:val="41937359"/>
     <w:multiLevelType w:val="hybridMultilevel"/>
     <w:tmpl w:val="936868CE"/>
@@ -3023,7 +3912,7 @@
       </w:rPr>
     </w:lvl>
   </w:abstractNum>
-  <w:abstractNum w:abstractNumId="7" w15:restartNumberingAfterBreak="0">
+  <w:abstractNum w:abstractNumId="9" w15:restartNumberingAfterBreak="0">
     <w:nsid w:val="54F744A5"/>
     <w:multiLevelType w:val="hybridMultilevel"/>
     <w:tmpl w:val="F09A036A"/>
@@ -3136,7 +4025,7 @@
       </w:rPr>
     </w:lvl>
   </w:abstractNum>
-  <w:abstractNum w:abstractNumId="8" w15:restartNumberingAfterBreak="0">
+  <w:abstractNum w:abstractNumId="10" w15:restartNumberingAfterBreak="0">
     <w:nsid w:val="5A02452E"/>
     <w:multiLevelType w:val="hybridMultilevel"/>
     <w:tmpl w:val="8CBA5E66"/>
@@ -3222,7 +4111,7 @@
       </w:pPr>
     </w:lvl>
   </w:abstractNum>
-  <w:abstractNum w:abstractNumId="9" w15:restartNumberingAfterBreak="0">
+  <w:abstractNum w:abstractNumId="11" w15:restartNumberingAfterBreak="0">
     <w:nsid w:val="70AE177A"/>
     <w:multiLevelType w:val="hybridMultilevel"/>
     <w:tmpl w:val="D42ADCE0"/>
@@ -3336,19 +4225,19 @@
     </w:lvl>
   </w:abstractNum>
   <w:num w:numId="1" w16cid:durableId="657071950">
-    <w:abstractNumId w:val="5"/>
+    <w:abstractNumId w:val="6"/>
   </w:num>
   <w:num w:numId="2" w16cid:durableId="142505159">
-    <w:abstractNumId w:val="6"/>
+    <w:abstractNumId w:val="8"/>
   </w:num>
   <w:num w:numId="3" w16cid:durableId="209272859">
     <w:abstractNumId w:val="3"/>
   </w:num>
   <w:num w:numId="4" w16cid:durableId="799153205">
-    <w:abstractNumId w:val="8"/>
+    <w:abstractNumId w:val="10"/>
   </w:num>
   <w:num w:numId="5" w16cid:durableId="127935222">
-    <w:abstractNumId w:val="9"/>
+    <w:abstractNumId w:val="11"/>
   </w:num>
   <w:num w:numId="6" w16cid:durableId="1182548229">
     <w:abstractNumId w:val="4"/>
@@ -3357,13 +4246,19 @@
     <w:abstractNumId w:val="1"/>
   </w:num>
   <w:num w:numId="8" w16cid:durableId="1933853919">
-    <w:abstractNumId w:val="7"/>
+    <w:abstractNumId w:val="9"/>
   </w:num>
   <w:num w:numId="9" w16cid:durableId="820581423">
     <w:abstractNumId w:val="2"/>
   </w:num>
   <w:num w:numId="10" w16cid:durableId="327711034">
     <w:abstractNumId w:val="0"/>
+  </w:num>
+  <w:num w:numId="11" w16cid:durableId="758523009">
+    <w:abstractNumId w:val="5"/>
+  </w:num>
+  <w:num w:numId="12" w16cid:durableId="43874686">
+    <w:abstractNumId w:val="7"/>
   </w:num>
 </w:numbering>
 </file>

</xml_diff>

<commit_message>
alteracoes analise requisitos - CTCS0004; adicao; debito; credito; validacao
</commit_message>
<xml_diff>
--- a/analise_requisitos_gerenciador_contas.docx
+++ b/analise_requisitos_gerenciador_contas.docx
@@ -4,25 +4,14 @@
   <w:body>
     <w:p>
       <w:pPr>
-        <w:jc w:val="center"/>
-        <w:rPr>
-          <w:rFonts w:ascii="Arial" w:hAnsi="Arial" w:cs="Arial"/>
-          <w:b/>
-          <w:bCs/>
-        </w:rPr>
-      </w:pPr>
-      <w:r>
-        <w:rPr>
-          <w:rFonts w:ascii="Arial" w:hAnsi="Arial" w:cs="Arial"/>
-          <w:b/>
-          <w:bCs/>
-        </w:rPr>
+        <w:pStyle w:val="Ttulo1"/>
+      </w:pPr>
+      <w:r>
         <w:t>Análise de Requisitos de Gerenciamento de Conta Corrente</w:t>
       </w:r>
     </w:p>
     <w:p>
       <w:pPr>
-        <w:jc w:val="center"/>
         <w:rPr>
           <w:rFonts w:ascii="Arial" w:hAnsi="Arial" w:cs="Arial"/>
           <w:b/>
@@ -54,30 +43,18 @@
     </w:p>
     <w:p>
       <w:pPr>
-        <w:jc w:val="both"/>
-        <w:rPr>
-          <w:rFonts w:ascii="Arial" w:hAnsi="Arial" w:cs="Arial"/>
-        </w:rPr>
-      </w:pPr>
-    </w:p>
-    <w:p>
-      <w:pPr>
-        <w:jc w:val="both"/>
-        <w:rPr>
-          <w:rFonts w:ascii="Arial" w:hAnsi="Arial" w:cs="Arial"/>
-          <w:b/>
-          <w:bCs/>
-        </w:rPr>
-      </w:pPr>
-      <w:r>
-        <w:rPr>
-          <w:rFonts w:ascii="Arial" w:hAnsi="Arial" w:cs="Arial"/>
-          <w:b/>
-          <w:bCs/>
-        </w:rPr>
+        <w:pStyle w:val="Ttulo2"/>
+      </w:pPr>
+    </w:p>
+    <w:p>
+      <w:pPr>
+        <w:pStyle w:val="Ttulo2"/>
+      </w:pPr>
+      <w:r>
         <w:t>Equipe de desenvolvimento</w:t>
       </w:r>
     </w:p>
+    <w:p/>
     <w:p>
       <w:pPr>
         <w:jc w:val="both"/>
@@ -132,22 +109,13 @@
     </w:p>
     <w:p>
       <w:pPr>
-        <w:jc w:val="both"/>
-        <w:rPr>
-          <w:rFonts w:ascii="Arial" w:hAnsi="Arial" w:cs="Arial"/>
-          <w:b/>
-          <w:bCs/>
-        </w:rPr>
-      </w:pPr>
-      <w:r>
-        <w:rPr>
-          <w:rFonts w:ascii="Arial" w:hAnsi="Arial" w:cs="Arial"/>
-          <w:b/>
-          <w:bCs/>
-        </w:rPr>
+        <w:pStyle w:val="Ttulo2"/>
+      </w:pPr>
+      <w:r>
         <w:t>Tecnologias utilizadas no Projeto</w:t>
       </w:r>
     </w:p>
+    <w:p/>
     <w:p>
       <w:pPr>
         <w:jc w:val="both"/>
@@ -226,19 +194,9 @@
     </w:p>
     <w:p>
       <w:pPr>
-        <w:jc w:val="both"/>
-        <w:rPr>
-          <w:rFonts w:ascii="Arial" w:hAnsi="Arial" w:cs="Arial"/>
-          <w:b/>
-          <w:bCs/>
-        </w:rPr>
-      </w:pPr>
-      <w:r>
-        <w:rPr>
-          <w:rFonts w:ascii="Arial" w:hAnsi="Arial" w:cs="Arial"/>
-          <w:b/>
-          <w:bCs/>
-        </w:rPr>
+        <w:pStyle w:val="Ttulo2"/>
+      </w:pPr>
+      <w:r>
         <w:t>Introdução</w:t>
       </w:r>
     </w:p>
@@ -254,19 +212,9 @@
     </w:p>
     <w:p>
       <w:pPr>
-        <w:jc w:val="both"/>
-        <w:rPr>
-          <w:rFonts w:ascii="Arial" w:hAnsi="Arial" w:cs="Arial"/>
-          <w:b/>
-          <w:bCs/>
-        </w:rPr>
-      </w:pPr>
-      <w:r>
-        <w:rPr>
-          <w:rFonts w:ascii="Arial" w:hAnsi="Arial" w:cs="Arial"/>
-          <w:b/>
-          <w:bCs/>
-        </w:rPr>
+        <w:pStyle w:val="Ttulo3"/>
+      </w:pPr>
+      <w:r>
         <w:t>Descrição Geral do Sistema</w:t>
       </w:r>
     </w:p>
@@ -334,35 +282,27 @@
     </w:p>
     <w:p>
       <w:pPr>
-        <w:jc w:val="both"/>
-        <w:rPr>
-          <w:rFonts w:ascii="Arial" w:hAnsi="Arial" w:cs="Arial"/>
-          <w:b/>
-          <w:bCs/>
-        </w:rPr>
-      </w:pPr>
-      <w:r>
-        <w:rPr>
-          <w:rFonts w:ascii="Arial" w:hAnsi="Arial" w:cs="Arial"/>
-          <w:b/>
-          <w:bCs/>
-        </w:rPr>
+        <w:pStyle w:val="Ttulo3"/>
+      </w:pPr>
+      <w:r>
         <w:t>Público-Alvo</w:t>
       </w:r>
     </w:p>
-    <w:p>
-      <w:pPr>
-        <w:jc w:val="both"/>
-        <w:rPr>
-          <w:rFonts w:ascii="Arial" w:hAnsi="Arial" w:cs="Arial"/>
-        </w:rPr>
-      </w:pPr>
-      <w:r>
-        <w:rPr>
-          <w:rFonts w:ascii="Arial" w:hAnsi="Arial" w:cs="Arial"/>
-          <w:b/>
-          <w:bCs/>
-        </w:rPr>
+    <w:p/>
+    <w:p>
+      <w:pPr>
+        <w:jc w:val="both"/>
+        <w:rPr>
+          <w:rFonts w:ascii="Arial" w:hAnsi="Arial" w:cs="Arial"/>
+        </w:rPr>
+      </w:pPr>
+      <w:r>
+        <w:rPr>
+          <w:rFonts w:ascii="Arial" w:hAnsi="Arial" w:cs="Arial"/>
+          <w:b/>
+          <w:bCs/>
+        </w:rPr>
+        <w:lastRenderedPageBreak/>
         <w:t xml:space="preserve">Clientes: </w:t>
       </w:r>
       <w:r>
@@ -428,19 +368,9 @@
     </w:p>
     <w:p>
       <w:pPr>
-        <w:jc w:val="both"/>
-        <w:rPr>
-          <w:rFonts w:ascii="Arial" w:hAnsi="Arial" w:cs="Arial"/>
-          <w:b/>
-          <w:bCs/>
-        </w:rPr>
-      </w:pPr>
-      <w:r>
-        <w:rPr>
-          <w:rFonts w:ascii="Arial" w:hAnsi="Arial" w:cs="Arial"/>
-          <w:b/>
-          <w:bCs/>
-        </w:rPr>
+        <w:pStyle w:val="Ttulo3"/>
+      </w:pPr>
+      <w:r>
         <w:t>Tipos de Requisitos</w:t>
       </w:r>
     </w:p>
@@ -449,13 +379,22 @@
         <w:jc w:val="both"/>
         <w:rPr>
           <w:rFonts w:ascii="Arial" w:hAnsi="Arial" w:cs="Arial"/>
-        </w:rPr>
-      </w:pPr>
-      <w:r>
-        <w:rPr>
-          <w:rFonts w:ascii="Arial" w:hAnsi="Arial" w:cs="Arial"/>
-        </w:rPr>
-        <w:lastRenderedPageBreak/>
+          <w:b/>
+          <w:bCs/>
+        </w:rPr>
+      </w:pPr>
+    </w:p>
+    <w:p>
+      <w:pPr>
+        <w:jc w:val="both"/>
+        <w:rPr>
+          <w:rFonts w:ascii="Arial" w:hAnsi="Arial" w:cs="Arial"/>
+        </w:rPr>
+      </w:pPr>
+      <w:r>
+        <w:rPr>
+          <w:rFonts w:ascii="Arial" w:hAnsi="Arial" w:cs="Arial"/>
+        </w:rPr>
         <w:t xml:space="preserve">Os requisitos do sistema são divididos em duas categorias: </w:t>
       </w:r>
       <w:r>
@@ -551,19 +490,9 @@
     </w:p>
     <w:p>
       <w:pPr>
-        <w:jc w:val="both"/>
-        <w:rPr>
-          <w:rFonts w:ascii="Arial" w:hAnsi="Arial" w:cs="Arial"/>
-          <w:b/>
-          <w:bCs/>
-        </w:rPr>
-      </w:pPr>
-      <w:r>
-        <w:rPr>
-          <w:rFonts w:ascii="Arial" w:hAnsi="Arial" w:cs="Arial"/>
-          <w:b/>
-          <w:bCs/>
-        </w:rPr>
+        <w:pStyle w:val="Ttulo3"/>
+      </w:pPr>
+      <w:r>
         <w:t>Níveis de Prioridade dos Requisitos</w:t>
       </w:r>
     </w:p>
@@ -572,6 +501,16 @@
         <w:jc w:val="both"/>
         <w:rPr>
           <w:rFonts w:ascii="Arial" w:hAnsi="Arial" w:cs="Arial"/>
+          <w:b/>
+          <w:bCs/>
+        </w:rPr>
+      </w:pPr>
+    </w:p>
+    <w:p>
+      <w:pPr>
+        <w:jc w:val="both"/>
+        <w:rPr>
+          <w:rFonts w:ascii="Arial" w:hAnsi="Arial" w:cs="Arial"/>
         </w:rPr>
       </w:pPr>
       <w:r>
@@ -657,19 +596,9 @@
     </w:p>
     <w:p>
       <w:pPr>
-        <w:jc w:val="both"/>
-        <w:rPr>
-          <w:rFonts w:ascii="Arial" w:hAnsi="Arial" w:cs="Arial"/>
-          <w:b/>
-          <w:bCs/>
-        </w:rPr>
-      </w:pPr>
-      <w:r>
-        <w:rPr>
-          <w:rFonts w:ascii="Arial" w:hAnsi="Arial" w:cs="Arial"/>
-          <w:b/>
-          <w:bCs/>
-        </w:rPr>
+        <w:pStyle w:val="Ttulo3"/>
+      </w:pPr>
+      <w:r>
         <w:t>Requisitos Funcionais</w:t>
       </w:r>
     </w:p>
@@ -886,6 +815,7 @@
         <w:rPr>
           <w:rFonts w:ascii="Arial" w:hAnsi="Arial" w:cs="Arial"/>
         </w:rPr>
+        <w:lastRenderedPageBreak/>
         <w:t>Nome;</w:t>
       </w:r>
     </w:p>
@@ -1076,7 +1006,6 @@
         <w:rPr>
           <w:rFonts w:ascii="Arial" w:hAnsi="Arial" w:cs="Arial"/>
         </w:rPr>
-        <w:lastRenderedPageBreak/>
         <w:t>A busca pela conta a ser excluída ou atualizada deve ser feita exclusivamente pela conta e agência da conta bancária;</w:t>
       </w:r>
     </w:p>
@@ -1497,6 +1426,7 @@
         <w:rPr>
           <w:rFonts w:ascii="Arial" w:hAnsi="Arial" w:cs="Arial"/>
         </w:rPr>
+        <w:lastRenderedPageBreak/>
         <w:t>Registro de saque em determinada conta;</w:t>
       </w:r>
     </w:p>
@@ -1632,27 +1562,24 @@
         <w:jc w:val="both"/>
         <w:rPr>
           <w:rFonts w:ascii="Arial" w:hAnsi="Arial" w:cs="Arial"/>
-          <w:b/>
-          <w:bCs/>
-        </w:rPr>
-      </w:pPr>
-    </w:p>
-    <w:p>
-      <w:pPr>
-        <w:jc w:val="both"/>
-        <w:rPr>
-          <w:rFonts w:ascii="Arial" w:hAnsi="Arial" w:cs="Arial"/>
-          <w:b/>
-          <w:bCs/>
-        </w:rPr>
-      </w:pPr>
-      <w:r>
-        <w:rPr>
-          <w:rFonts w:ascii="Arial" w:hAnsi="Arial" w:cs="Arial"/>
-          <w:b/>
-          <w:bCs/>
-        </w:rPr>
-        <w:lastRenderedPageBreak/>
+        </w:rPr>
+      </w:pPr>
+    </w:p>
+    <w:p>
+      <w:pPr>
+        <w:jc w:val="both"/>
+        <w:rPr>
+          <w:rFonts w:ascii="Arial" w:hAnsi="Arial" w:cs="Arial"/>
+          <w:b/>
+          <w:bCs/>
+        </w:rPr>
+      </w:pPr>
+      <w:r>
+        <w:rPr>
+          <w:rFonts w:ascii="Arial" w:hAnsi="Arial" w:cs="Arial"/>
+          <w:b/>
+          <w:bCs/>
+        </w:rPr>
         <w:t>RF004 – Programa que permite a realização de transferências</w:t>
       </w:r>
       <w:r>
@@ -2003,6 +1930,131 @@
     </w:p>
     <w:p>
       <w:pPr>
+        <w:pStyle w:val="PargrafodaLista"/>
+        <w:numPr>
+          <w:ilvl w:val="0"/>
+          <w:numId w:val="11"/>
+        </w:numPr>
+        <w:jc w:val="both"/>
+        <w:rPr>
+          <w:rFonts w:ascii="Arial" w:hAnsi="Arial" w:cs="Arial"/>
+          <w:b/>
+          <w:bCs/>
+        </w:rPr>
+      </w:pPr>
+      <w:r>
+        <w:rPr>
+          <w:rFonts w:ascii="Arial" w:hAnsi="Arial" w:cs="Arial"/>
+        </w:rPr>
+        <w:t>Validar dados de entrada;</w:t>
+      </w:r>
+    </w:p>
+    <w:p>
+      <w:pPr>
+        <w:pStyle w:val="PargrafodaLista"/>
+        <w:numPr>
+          <w:ilvl w:val="1"/>
+          <w:numId w:val="11"/>
+        </w:numPr>
+        <w:jc w:val="both"/>
+        <w:rPr>
+          <w:rFonts w:ascii="Arial" w:hAnsi="Arial" w:cs="Arial"/>
+          <w:b/>
+          <w:bCs/>
+        </w:rPr>
+      </w:pPr>
+      <w:r>
+        <w:rPr>
+          <w:rFonts w:ascii="Arial" w:hAnsi="Arial" w:cs="Arial"/>
+        </w:rPr>
+        <w:t>Se as contas e agências possuem dígitos verificadores válidos;</w:t>
+      </w:r>
+    </w:p>
+    <w:p>
+      <w:pPr>
+        <w:pStyle w:val="PargrafodaLista"/>
+        <w:numPr>
+          <w:ilvl w:val="2"/>
+          <w:numId w:val="11"/>
+        </w:numPr>
+        <w:jc w:val="both"/>
+        <w:rPr>
+          <w:rFonts w:ascii="Arial" w:hAnsi="Arial" w:cs="Arial"/>
+          <w:b/>
+          <w:bCs/>
+        </w:rPr>
+      </w:pPr>
+      <w:r>
+        <w:rPr>
+          <w:rFonts w:ascii="Arial" w:hAnsi="Arial" w:cs="Arial"/>
+        </w:rPr>
+        <w:t>Simula a ideia de que as contas dos envolvidos realmente existem;</w:t>
+      </w:r>
+    </w:p>
+    <w:p>
+      <w:pPr>
+        <w:pStyle w:val="PargrafodaLista"/>
+        <w:numPr>
+          <w:ilvl w:val="1"/>
+          <w:numId w:val="11"/>
+        </w:numPr>
+        <w:jc w:val="both"/>
+        <w:rPr>
+          <w:rFonts w:ascii="Arial" w:hAnsi="Arial" w:cs="Arial"/>
+          <w:b/>
+          <w:bCs/>
+        </w:rPr>
+      </w:pPr>
+      <w:r>
+        <w:rPr>
+          <w:rFonts w:ascii="Arial" w:hAnsi="Arial" w:cs="Arial"/>
+        </w:rPr>
+        <w:t>Verificar se o saldo supera o limite diário;</w:t>
+      </w:r>
+    </w:p>
+    <w:p>
+      <w:pPr>
+        <w:pStyle w:val="PargrafodaLista"/>
+        <w:numPr>
+          <w:ilvl w:val="0"/>
+          <w:numId w:val="11"/>
+        </w:numPr>
+        <w:jc w:val="both"/>
+        <w:rPr>
+          <w:rFonts w:ascii="Arial" w:hAnsi="Arial" w:cs="Arial"/>
+          <w:b/>
+          <w:bCs/>
+        </w:rPr>
+      </w:pPr>
+      <w:r>
+        <w:rPr>
+          <w:rFonts w:ascii="Arial" w:hAnsi="Arial" w:cs="Arial"/>
+        </w:rPr>
+        <w:t xml:space="preserve">Programa deve simular um </w:t>
+      </w:r>
+      <w:proofErr w:type="spellStart"/>
+      <w:r>
+        <w:rPr>
+          <w:rFonts w:ascii="Arial" w:hAnsi="Arial" w:cs="Arial"/>
+        </w:rPr>
+        <w:t>rollback</w:t>
+      </w:r>
+      <w:proofErr w:type="spellEnd"/>
+      <w:r>
+        <w:rPr>
+          <w:rFonts w:ascii="Arial" w:hAnsi="Arial" w:cs="Arial"/>
+        </w:rPr>
+        <w:t xml:space="preserve"> caso ocorra um erro ao debitar saldo do ordenante ou ao creditar na conta do remetente</w:t>
+      </w:r>
+      <w:r>
+        <w:rPr>
+          <w:rFonts w:ascii="Arial" w:hAnsi="Arial" w:cs="Arial"/>
+        </w:rPr>
+        <w:t>;</w:t>
+      </w:r>
+    </w:p>
+    <w:p>
+      <w:pPr>
         <w:jc w:val="both"/>
         <w:rPr>
           <w:rFonts w:ascii="Arial" w:hAnsi="Arial" w:cs="Arial"/>
@@ -2050,19 +2102,9 @@
     </w:p>
     <w:p>
       <w:pPr>
-        <w:jc w:val="both"/>
-        <w:rPr>
-          <w:rFonts w:ascii="Arial" w:hAnsi="Arial" w:cs="Arial"/>
-          <w:b/>
-          <w:bCs/>
-        </w:rPr>
-      </w:pPr>
-      <w:r>
-        <w:rPr>
-          <w:rFonts w:ascii="Arial" w:hAnsi="Arial" w:cs="Arial"/>
-          <w:b/>
-          <w:bCs/>
-        </w:rPr>
+        <w:pStyle w:val="Ttulo3"/>
+      </w:pPr>
+      <w:r>
         <w:t>Requisitos não funcionais</w:t>
       </w:r>
     </w:p>
@@ -2075,6 +2117,16 @@
           <w:bCs/>
         </w:rPr>
       </w:pPr>
+    </w:p>
+    <w:p>
+      <w:pPr>
+        <w:jc w:val="both"/>
+        <w:rPr>
+          <w:rFonts w:ascii="Arial" w:hAnsi="Arial" w:cs="Arial"/>
+          <w:b/>
+          <w:bCs/>
+        </w:rPr>
+      </w:pPr>
       <w:r>
         <w:rPr>
           <w:rFonts w:ascii="Arial" w:hAnsi="Arial" w:cs="Arial"/>
@@ -2107,25 +2159,23 @@
           <w:b/>
           <w:bCs/>
         </w:rPr>
+        <w:t xml:space="preserve"> de</w:t>
+      </w:r>
+      <w:r>
+        <w:rPr>
+          <w:rFonts w:ascii="Arial" w:hAnsi="Arial" w:cs="Arial"/>
+          <w:b/>
+          <w:bCs/>
+        </w:rPr>
         <w:t xml:space="preserve"> </w:t>
       </w:r>
-      <w:proofErr w:type="spellStart"/>
-      <w:r>
-        <w:rPr>
-          <w:rFonts w:ascii="Arial" w:hAnsi="Arial" w:cs="Arial"/>
-          <w:b/>
-          <w:bCs/>
-        </w:rPr>
-        <w:t>dedocumentação</w:t>
-      </w:r>
-      <w:proofErr w:type="spellEnd"/>
-      <w:r>
-        <w:rPr>
-          <w:rFonts w:ascii="Arial" w:hAnsi="Arial" w:cs="Arial"/>
-          <w:b/>
-          <w:bCs/>
-        </w:rPr>
-        <w:t xml:space="preserve"> interna</w:t>
+      <w:r>
+        <w:rPr>
+          <w:rFonts w:ascii="Arial" w:hAnsi="Arial" w:cs="Arial"/>
+          <w:b/>
+          <w:bCs/>
+        </w:rPr>
+        <w:t>documentação interna</w:t>
       </w:r>
       <w:r>
         <w:rPr>
@@ -2147,6 +2197,7 @@
         <w:rPr>
           <w:rFonts w:ascii="Arial" w:hAnsi="Arial" w:cs="Arial"/>
         </w:rPr>
+        <w:lastRenderedPageBreak/>
         <w:t>*------------------------------------------------------------------------</w:t>
       </w:r>
     </w:p>
@@ -2430,6 +2481,515 @@
           <w:rFonts w:ascii="Arial" w:hAnsi="Arial" w:cs="Arial"/>
         </w:rPr>
         <w:t xml:space="preserve"> Inesperado (defeito, condição não mapeada)</w:t>
+      </w:r>
+    </w:p>
+    <w:p>
+      <w:pPr>
+        <w:jc w:val="both"/>
+        <w:rPr>
+          <w:rFonts w:ascii="Arial" w:hAnsi="Arial" w:cs="Arial"/>
+          <w:b/>
+          <w:bCs/>
+        </w:rPr>
+      </w:pPr>
+      <w:r>
+        <w:rPr>
+          <w:rFonts w:ascii="Arial" w:hAnsi="Arial" w:cs="Arial"/>
+          <w:b/>
+          <w:bCs/>
+        </w:rPr>
+        <w:t>RNF003 – Tabela com valores possíveis (não todos) do FILE STATUS</w:t>
+      </w:r>
+    </w:p>
+    <w:p>
+      <w:pPr>
+        <w:jc w:val="both"/>
+        <w:rPr>
+          <w:rFonts w:ascii="Arial" w:hAnsi="Arial" w:cs="Arial"/>
+        </w:rPr>
+      </w:pPr>
+      <w:r>
+        <w:rPr>
+          <w:rFonts w:ascii="Arial" w:hAnsi="Arial" w:cs="Arial"/>
+        </w:rPr>
+        <w:t>CÓDIGO | SIGNIFICADO</w:t>
+      </w:r>
+    </w:p>
+    <w:p>
+      <w:pPr>
+        <w:jc w:val="both"/>
+        <w:rPr>
+          <w:rFonts w:ascii="Arial" w:hAnsi="Arial" w:cs="Arial"/>
+        </w:rPr>
+      </w:pPr>
+      <w:r>
+        <w:rPr>
+          <w:rFonts w:ascii="Arial" w:hAnsi="Arial" w:cs="Arial"/>
+        </w:rPr>
+        <w:t>---------------------------------------------------------------</w:t>
+      </w:r>
+    </w:p>
+    <w:p>
+      <w:pPr>
+        <w:jc w:val="both"/>
+        <w:rPr>
+          <w:rFonts w:ascii="Arial" w:hAnsi="Arial" w:cs="Arial"/>
+        </w:rPr>
+      </w:pPr>
+      <w:r>
+        <w:rPr>
+          <w:rFonts w:ascii="Arial" w:hAnsi="Arial" w:cs="Arial"/>
+        </w:rPr>
+        <w:t>00     | Sucesso</w:t>
+      </w:r>
+    </w:p>
+    <w:p>
+      <w:pPr>
+        <w:jc w:val="both"/>
+        <w:rPr>
+          <w:rFonts w:ascii="Arial" w:hAnsi="Arial" w:cs="Arial"/>
+        </w:rPr>
+      </w:pPr>
+      <w:r>
+        <w:rPr>
+          <w:rFonts w:ascii="Arial" w:hAnsi="Arial" w:cs="Arial"/>
+        </w:rPr>
+        <w:t>02     | Chave duplicada</w:t>
+      </w:r>
+    </w:p>
+    <w:p>
+      <w:pPr>
+        <w:jc w:val="both"/>
+        <w:rPr>
+          <w:rFonts w:ascii="Arial" w:hAnsi="Arial" w:cs="Arial"/>
+        </w:rPr>
+      </w:pPr>
+      <w:r>
+        <w:rPr>
+          <w:rFonts w:ascii="Arial" w:hAnsi="Arial" w:cs="Arial"/>
+        </w:rPr>
+        <w:t>04     | Tamanho de registro incorreto</w:t>
+      </w:r>
+    </w:p>
+    <w:p>
+      <w:pPr>
+        <w:jc w:val="both"/>
+        <w:rPr>
+          <w:rFonts w:ascii="Arial" w:hAnsi="Arial" w:cs="Arial"/>
+        </w:rPr>
+      </w:pPr>
+      <w:r>
+        <w:rPr>
+          <w:rFonts w:ascii="Arial" w:hAnsi="Arial" w:cs="Arial"/>
+        </w:rPr>
+        <w:t>05     | Arquivo não encontrado (opcional)</w:t>
+      </w:r>
+    </w:p>
+    <w:p>
+      <w:pPr>
+        <w:jc w:val="both"/>
+        <w:rPr>
+          <w:rFonts w:ascii="Arial" w:hAnsi="Arial" w:cs="Arial"/>
+        </w:rPr>
+      </w:pPr>
+      <w:r>
+        <w:rPr>
+          <w:rFonts w:ascii="Arial" w:hAnsi="Arial" w:cs="Arial"/>
+        </w:rPr>
+        <w:t>10     | Fim de arquivo</w:t>
+      </w:r>
+    </w:p>
+    <w:p>
+      <w:pPr>
+        <w:jc w:val="both"/>
+        <w:rPr>
+          <w:rFonts w:ascii="Arial" w:hAnsi="Arial" w:cs="Arial"/>
+        </w:rPr>
+      </w:pPr>
+      <w:r>
+        <w:rPr>
+          <w:rFonts w:ascii="Arial" w:hAnsi="Arial" w:cs="Arial"/>
+        </w:rPr>
+        <w:t>21     | Chave inválida</w:t>
+      </w:r>
+    </w:p>
+    <w:p>
+      <w:pPr>
+        <w:jc w:val="both"/>
+        <w:rPr>
+          <w:rFonts w:ascii="Arial" w:hAnsi="Arial" w:cs="Arial"/>
+        </w:rPr>
+      </w:pPr>
+      <w:r>
+        <w:rPr>
+          <w:rFonts w:ascii="Arial" w:hAnsi="Arial" w:cs="Arial"/>
+        </w:rPr>
+        <w:t>22     | Registro duplicado (WRITE)</w:t>
+      </w:r>
+    </w:p>
+    <w:p>
+      <w:pPr>
+        <w:jc w:val="both"/>
+        <w:rPr>
+          <w:rFonts w:ascii="Arial" w:hAnsi="Arial" w:cs="Arial"/>
+        </w:rPr>
+      </w:pPr>
+      <w:r>
+        <w:rPr>
+          <w:rFonts w:ascii="Arial" w:hAnsi="Arial" w:cs="Arial"/>
+        </w:rPr>
+        <w:t>23     | Registro não encontrado</w:t>
+      </w:r>
+    </w:p>
+    <w:p>
+      <w:pPr>
+        <w:jc w:val="both"/>
+        <w:rPr>
+          <w:rFonts w:ascii="Arial" w:hAnsi="Arial" w:cs="Arial"/>
+        </w:rPr>
+      </w:pPr>
+      <w:r>
+        <w:rPr>
+          <w:rFonts w:ascii="Arial" w:hAnsi="Arial" w:cs="Arial"/>
+        </w:rPr>
+        <w:t>24     | Limite do arquivo atingido</w:t>
+      </w:r>
+    </w:p>
+    <w:p>
+      <w:pPr>
+        <w:jc w:val="both"/>
+        <w:rPr>
+          <w:rFonts w:ascii="Arial" w:hAnsi="Arial" w:cs="Arial"/>
+        </w:rPr>
+      </w:pPr>
+      <w:r>
+        <w:rPr>
+          <w:rFonts w:ascii="Arial" w:hAnsi="Arial" w:cs="Arial"/>
+        </w:rPr>
+        <w:t>30     | Erro permanente de I/O</w:t>
+      </w:r>
+    </w:p>
+    <w:p>
+      <w:pPr>
+        <w:jc w:val="both"/>
+        <w:rPr>
+          <w:rFonts w:ascii="Arial" w:hAnsi="Arial" w:cs="Arial"/>
+        </w:rPr>
+      </w:pPr>
+      <w:r>
+        <w:rPr>
+          <w:rFonts w:ascii="Arial" w:hAnsi="Arial" w:cs="Arial"/>
+        </w:rPr>
+        <w:t>34     | Arquivo cheio</w:t>
+      </w:r>
+    </w:p>
+    <w:p>
+      <w:pPr>
+        <w:jc w:val="both"/>
+        <w:rPr>
+          <w:rFonts w:ascii="Arial" w:hAnsi="Arial" w:cs="Arial"/>
+        </w:rPr>
+      </w:pPr>
+      <w:r>
+        <w:rPr>
+          <w:rFonts w:ascii="Arial" w:hAnsi="Arial" w:cs="Arial"/>
+        </w:rPr>
+        <w:t>35     | Arquivo inexistente</w:t>
+      </w:r>
+    </w:p>
+    <w:p>
+      <w:pPr>
+        <w:jc w:val="both"/>
+        <w:rPr>
+          <w:rFonts w:ascii="Arial" w:hAnsi="Arial" w:cs="Arial"/>
+        </w:rPr>
+      </w:pPr>
+      <w:r>
+        <w:rPr>
+          <w:rFonts w:ascii="Arial" w:hAnsi="Arial" w:cs="Arial"/>
+        </w:rPr>
+        <w:t>37     | OPEN modo incorreto</w:t>
+      </w:r>
+    </w:p>
+    <w:p>
+      <w:pPr>
+        <w:jc w:val="both"/>
+        <w:rPr>
+          <w:rFonts w:ascii="Arial" w:hAnsi="Arial" w:cs="Arial"/>
+        </w:rPr>
+      </w:pPr>
+      <w:r>
+        <w:rPr>
+          <w:rFonts w:ascii="Arial" w:hAnsi="Arial" w:cs="Arial"/>
+        </w:rPr>
+        <w:t>38     | Arquivo bloqueado</w:t>
+      </w:r>
+    </w:p>
+    <w:p>
+      <w:pPr>
+        <w:jc w:val="both"/>
+        <w:rPr>
+          <w:rFonts w:ascii="Arial" w:hAnsi="Arial" w:cs="Arial"/>
+        </w:rPr>
+      </w:pPr>
+      <w:r>
+        <w:rPr>
+          <w:rFonts w:ascii="Arial" w:hAnsi="Arial" w:cs="Arial"/>
+        </w:rPr>
+        <w:lastRenderedPageBreak/>
+        <w:t>39     | Conflito de definição</w:t>
+      </w:r>
+    </w:p>
+    <w:p>
+      <w:pPr>
+        <w:jc w:val="both"/>
+        <w:rPr>
+          <w:rFonts w:ascii="Arial" w:hAnsi="Arial" w:cs="Arial"/>
+        </w:rPr>
+      </w:pPr>
+      <w:r>
+        <w:rPr>
+          <w:rFonts w:ascii="Arial" w:hAnsi="Arial" w:cs="Arial"/>
+        </w:rPr>
+        <w:t>41     | Arquivo já aberto</w:t>
+      </w:r>
+    </w:p>
+    <w:p>
+      <w:pPr>
+        <w:jc w:val="both"/>
+        <w:rPr>
+          <w:rFonts w:ascii="Arial" w:hAnsi="Arial" w:cs="Arial"/>
+        </w:rPr>
+      </w:pPr>
+      <w:r>
+        <w:rPr>
+          <w:rFonts w:ascii="Arial" w:hAnsi="Arial" w:cs="Arial"/>
+        </w:rPr>
+        <w:t>42     | Arquivo não aberto</w:t>
+      </w:r>
+    </w:p>
+    <w:p>
+      <w:pPr>
+        <w:jc w:val="both"/>
+        <w:rPr>
+          <w:rFonts w:ascii="Arial" w:hAnsi="Arial" w:cs="Arial"/>
+        </w:rPr>
+      </w:pPr>
+      <w:r>
+        <w:rPr>
+          <w:rFonts w:ascii="Arial" w:hAnsi="Arial" w:cs="Arial"/>
+        </w:rPr>
+        <w:t>43     | Operação sem OPEN</w:t>
+      </w:r>
+    </w:p>
+    <w:p>
+      <w:pPr>
+        <w:jc w:val="both"/>
+        <w:rPr>
+          <w:rFonts w:ascii="Arial" w:hAnsi="Arial" w:cs="Arial"/>
+        </w:rPr>
+      </w:pPr>
+      <w:r>
+        <w:rPr>
+          <w:rFonts w:ascii="Arial" w:hAnsi="Arial" w:cs="Arial"/>
+        </w:rPr>
+        <w:t>44     | REWRITE inválido</w:t>
+      </w:r>
+    </w:p>
+    <w:p>
+      <w:pPr>
+        <w:jc w:val="both"/>
+        <w:rPr>
+          <w:rFonts w:ascii="Arial" w:hAnsi="Arial" w:cs="Arial"/>
+        </w:rPr>
+      </w:pPr>
+      <w:r>
+        <w:rPr>
+          <w:rFonts w:ascii="Arial" w:hAnsi="Arial" w:cs="Arial"/>
+        </w:rPr>
+        <w:t>46     | READ fora da sequência</w:t>
+      </w:r>
+    </w:p>
+    <w:p>
+      <w:pPr>
+        <w:jc w:val="both"/>
+        <w:rPr>
+          <w:rFonts w:ascii="Arial" w:hAnsi="Arial" w:cs="Arial"/>
+        </w:rPr>
+      </w:pPr>
+      <w:r>
+        <w:rPr>
+          <w:rFonts w:ascii="Arial" w:hAnsi="Arial" w:cs="Arial"/>
+        </w:rPr>
+        <w:t>47     | WRITE após fim</w:t>
+      </w:r>
+    </w:p>
+    <w:p>
+      <w:pPr>
+        <w:jc w:val="both"/>
+        <w:rPr>
+          <w:rFonts w:ascii="Arial" w:hAnsi="Arial" w:cs="Arial"/>
+        </w:rPr>
+      </w:pPr>
+      <w:r>
+        <w:rPr>
+          <w:rFonts w:ascii="Arial" w:hAnsi="Arial" w:cs="Arial"/>
+        </w:rPr>
+        <w:t>48     | WRITE em arquivo fechado</w:t>
+      </w:r>
+    </w:p>
+    <w:p>
+      <w:pPr>
+        <w:jc w:val="both"/>
+        <w:rPr>
+          <w:rFonts w:ascii="Arial" w:hAnsi="Arial" w:cs="Arial"/>
+        </w:rPr>
+      </w:pPr>
+      <w:r>
+        <w:rPr>
+          <w:rFonts w:ascii="Arial" w:hAnsi="Arial" w:cs="Arial"/>
+        </w:rPr>
+        <w:t>49     | DELETE/REWRITE inválido</w:t>
+      </w:r>
+    </w:p>
+    <w:p>
+      <w:pPr>
+        <w:jc w:val="both"/>
+        <w:rPr>
+          <w:rFonts w:ascii="Arial" w:hAnsi="Arial" w:cs="Arial"/>
+        </w:rPr>
+      </w:pPr>
+      <w:r>
+        <w:rPr>
+          <w:rFonts w:ascii="Arial" w:hAnsi="Arial" w:cs="Arial"/>
+        </w:rPr>
+        <w:t>90     | Erro genérico de I/O</w:t>
+      </w:r>
+    </w:p>
+    <w:p>
+      <w:pPr>
+        <w:jc w:val="both"/>
+        <w:rPr>
+          <w:rFonts w:ascii="Arial" w:hAnsi="Arial" w:cs="Arial"/>
+        </w:rPr>
+      </w:pPr>
+      <w:r>
+        <w:rPr>
+          <w:rFonts w:ascii="Arial" w:hAnsi="Arial" w:cs="Arial"/>
+        </w:rPr>
+        <w:t>91     | Arquivo bloqueado (</w:t>
+      </w:r>
+      <w:proofErr w:type="spellStart"/>
+      <w:r>
+        <w:rPr>
+          <w:rFonts w:ascii="Arial" w:hAnsi="Arial" w:cs="Arial"/>
+        </w:rPr>
+        <w:t>lock</w:t>
+      </w:r>
+      <w:proofErr w:type="spellEnd"/>
+      <w:r>
+        <w:rPr>
+          <w:rFonts w:ascii="Arial" w:hAnsi="Arial" w:cs="Arial"/>
+        </w:rPr>
+        <w:t>)</w:t>
+      </w:r>
+    </w:p>
+    <w:p>
+      <w:pPr>
+        <w:jc w:val="both"/>
+        <w:rPr>
+          <w:rFonts w:ascii="Arial" w:hAnsi="Arial" w:cs="Arial"/>
+        </w:rPr>
+      </w:pPr>
+      <w:r>
+        <w:rPr>
+          <w:rFonts w:ascii="Arial" w:hAnsi="Arial" w:cs="Arial"/>
+        </w:rPr>
+        <w:t>92     | Erro lógico em indexado</w:t>
+      </w:r>
+    </w:p>
+    <w:p>
+      <w:pPr>
+        <w:jc w:val="both"/>
+        <w:rPr>
+          <w:rFonts w:ascii="Arial" w:hAnsi="Arial" w:cs="Arial"/>
+        </w:rPr>
+      </w:pPr>
+      <w:r>
+        <w:rPr>
+          <w:rFonts w:ascii="Arial" w:hAnsi="Arial" w:cs="Arial"/>
+        </w:rPr>
+        <w:t>93     | Arquivo não disponível</w:t>
+      </w:r>
+    </w:p>
+    <w:p>
+      <w:pPr>
+        <w:jc w:val="both"/>
+        <w:rPr>
+          <w:rFonts w:ascii="Arial" w:hAnsi="Arial" w:cs="Arial"/>
+        </w:rPr>
+      </w:pPr>
+      <w:r>
+        <w:rPr>
+          <w:rFonts w:ascii="Arial" w:hAnsi="Arial" w:cs="Arial"/>
+        </w:rPr>
+        <w:t>94     | Violação de integridade</w:t>
+      </w:r>
+    </w:p>
+    <w:p>
+      <w:pPr>
+        <w:jc w:val="both"/>
+        <w:rPr>
+          <w:rFonts w:ascii="Arial" w:hAnsi="Arial" w:cs="Arial"/>
+        </w:rPr>
+      </w:pPr>
+      <w:r>
+        <w:rPr>
+          <w:rFonts w:ascii="Arial" w:hAnsi="Arial" w:cs="Arial"/>
+        </w:rPr>
+        <w:t>95     | Erro de sistema</w:t>
+      </w:r>
+    </w:p>
+    <w:p>
+      <w:pPr>
+        <w:jc w:val="both"/>
+        <w:rPr>
+          <w:rFonts w:ascii="Arial" w:hAnsi="Arial" w:cs="Arial"/>
+        </w:rPr>
+      </w:pPr>
+      <w:r>
+        <w:rPr>
+          <w:rFonts w:ascii="Arial" w:hAnsi="Arial" w:cs="Arial"/>
+        </w:rPr>
+        <w:t>97     | OPEN incorreto</w:t>
+      </w:r>
+    </w:p>
+    <w:p>
+      <w:pPr>
+        <w:jc w:val="both"/>
+        <w:rPr>
+          <w:rFonts w:ascii="Arial" w:hAnsi="Arial" w:cs="Arial"/>
+        </w:rPr>
+      </w:pPr>
+      <w:r>
+        <w:rPr>
+          <w:rFonts w:ascii="Arial" w:hAnsi="Arial" w:cs="Arial"/>
+        </w:rPr>
+        <w:t>98     | Conflito de acesso</w:t>
+      </w:r>
+    </w:p>
+    <w:p>
+      <w:pPr>
+        <w:jc w:val="both"/>
+        <w:rPr>
+          <w:rFonts w:ascii="Arial" w:hAnsi="Arial" w:cs="Arial"/>
+        </w:rPr>
+      </w:pPr>
+      <w:r>
+        <w:rPr>
+          <w:rFonts w:ascii="Arial" w:hAnsi="Arial" w:cs="Arial"/>
+        </w:rPr>
+        <w:t>99     | Erro desconhecido</w:t>
       </w:r>
     </w:p>
     <w:p>
@@ -4691,7 +5251,6 @@
     <w:next w:val="Normal"/>
     <w:link w:val="Ttulo2Char"/>
     <w:uiPriority w:val="9"/>
-    <w:semiHidden/>
     <w:unhideWhenUsed/>
     <w:qFormat/>
     <w:rsid w:val="00C72EAF"/>
@@ -4714,7 +5273,6 @@
     <w:next w:val="Normal"/>
     <w:link w:val="Ttulo3Char"/>
     <w:uiPriority w:val="9"/>
-    <w:semiHidden/>
     <w:unhideWhenUsed/>
     <w:qFormat/>
     <w:rsid w:val="00C72EAF"/>
@@ -4866,7 +5424,6 @@
   <w:style w:type="character" w:default="1" w:styleId="Fontepargpadro">
     <w:name w:val="Default Paragraph Font"/>
     <w:uiPriority w:val="1"/>
-    <w:semiHidden/>
     <w:unhideWhenUsed/>
   </w:style>
   <w:style w:type="table" w:default="1" w:styleId="Tabelanormal">
@@ -4908,7 +5465,6 @@
     <w:basedOn w:val="Fontepargpadro"/>
     <w:link w:val="Ttulo2"/>
     <w:uiPriority w:val="9"/>
-    <w:semiHidden/>
     <w:rsid w:val="00C72EAF"/>
     <w:rPr>
       <w:rFonts w:asciiTheme="majorHAnsi" w:eastAsiaTheme="majorEastAsia" w:hAnsiTheme="majorHAnsi" w:cstheme="majorBidi"/>
@@ -4922,7 +5478,6 @@
     <w:basedOn w:val="Fontepargpadro"/>
     <w:link w:val="Ttulo3"/>
     <w:uiPriority w:val="9"/>
-    <w:semiHidden/>
     <w:rsid w:val="00C72EAF"/>
     <w:rPr>
       <w:rFonts w:eastAsiaTheme="majorEastAsia" w:cstheme="majorBidi"/>

</xml_diff>